<commit_message>
Add unit tests for JobStore and Workspace functionality
- Implement tests for JobStore covering CRUD operations, TTL eviction, concurrency, and path safety in test_storage.py.
- Introduce tests for Workspace pattern including path validation, MIME detection, storage CRUD operations, and materialization in test_workspace.py.
</commit_message>
<xml_diff>
--- a/data/lms/output/huong-dan-su-dung.docx
+++ b/data/lms/output/huong-dan-su-dung.docx
@@ -313,7 +313,7 @@
                 <w:sz w:val="26"/>
                 <w:szCs w:val="26"/>
               </w:rPr>
-              <w:t xml:space="preserve">Ban hành: 23/04/2026</w:t>
+              <w:t xml:space="preserve">Ban hành: 24/04/2026</w:t>
             </w:r>
             <w:proofErr w:type="spellStart"/>
             <w:r>
@@ -380,7 +380,7 @@
           <w:sz w:val="26"/>
           <w:szCs w:val="26"/>
         </w:rPr>
-        <w:t xml:space="preserve">DỰ ÁN: EDUPROCTOR — LMS  THI TRỰC TUYẾN CÓ GIÁM SÁT</w:t>
+        <w:t xml:space="preserve">DỰ ÁN: EDUPROCTOR - ONLINE LEARNING  PROCTORED EXAMINATION PLATFORM</w:t>
       </w:r>
       <w:r>
         <w:rPr>
@@ -445,7 +445,7 @@
           <w:sz w:val="26"/>
           <w:szCs w:val="26"/>
         </w:rPr>
-        <w:t xml:space="preserve">Dự án: EduProctor — LMS  Thi trực tuyến có giám sát</w:t>
+        <w:t xml:space="preserve">Dự án: EduProctor - Online Learning  Proctored Examination Platform</w:t>
       </w:r>
       <w:proofErr w:type="spellEnd"/>
       <w:r>
@@ -1066,7 +1066,7 @@
           </w:tcPr>
           <w:p>
             <w:r>
-              <w:t xml:space="preserve">23/04/2026</w:t>
+              <w:t xml:space="preserve">24/04/2026</w:t>
             </w:r>
           </w:p>
         </w:tc>
@@ -4452,7 +4452,7 @@
         <w:pStyle w:val="ETCContent"/>
       </w:pPr>
       <w:r>
-        <w:t xml:space="preserve">Hướng dẫn sử dụng và bộ tài liệu thiết kế cho EduProctor — nền tảng đào tạo trực tuyến, thi có giám sát AI, xác thực eKYC và quản lý khóa học phía giảng viên.</w:t>
+        <w:t xml:space="preserve">Chuẩn hóa tài liệu kỹ thuật và hướng dẫn sử dụng cho hệ thống EduProctor nhằm phục vụ triển khai, vận hành và nghiệm thu.</w:t>
       </w:r>
     </w:p>
     <w:p>
@@ -4504,7 +4504,7 @@
         <w:pStyle w:val="ETCContent"/>
       </w:pPr>
       <w:r>
-        <w:t xml:space="preserve">Học viên: duyệt khóa học, xem video, theo dõi lịch thi, eKYC, vào phòng thi. Giảng viên: tạo khóa học, cấu trúc bài giảng, câu hỏi, lịch thi. Hệ thống: API NestJS, web Next.js, dịch vụ proctoring qua WebSocket.</w:t>
+        <w:t xml:space="preserve">Bao gồm web frontend, API backend, dịch vụ proctoring realtime, cơ sở dữ liệu và cache.</w:t>
       </w:r>
     </w:p>
     <w:p>
@@ -4872,7 +4872,7 @@
           </w:tcPr>
           <w:p>
             <w:r>
-              <w:t xml:space="preserve">LMS</w:t>
+              <w:t xml:space="preserve">HDSD</w:t>
             </w:r>
           </w:p>
         </w:tc>
@@ -4882,7 +4882,7 @@
           </w:tcPr>
           <w:p>
             <w:r>
-              <w:t xml:space="preserve">Learning Management System</w:t>
+              <w:t xml:space="preserve">Hướng dẫn sử dụng</w:t>
             </w:r>
           </w:p>
         </w:tc>
@@ -4892,7 +4892,7 @@
           </w:tcPr>
           <w:p>
             <w:r>
-              <w:t xml:space="preserve">Hệ thống quản lý học tập</w:t>
+              <w:t xml:space="preserve">Tài liệu thao tác cho người dùng cuối</w:t>
             </w:r>
           </w:p>
         </w:tc>
@@ -4904,7 +4904,7 @@
           </w:tcPr>
           <w:p>
             <w:r>
-              <w:t xml:space="preserve">eKYC</w:t>
+              <w:t xml:space="preserve">TKKT</w:t>
             </w:r>
           </w:p>
         </w:tc>
@@ -4914,7 +4914,7 @@
           </w:tcPr>
           <w:p>
             <w:r>
-              <w:t xml:space="preserve">electronic Know Your Customer</w:t>
+              <w:t xml:space="preserve">Thiết kế kiến trúc</w:t>
             </w:r>
           </w:p>
         </w:tc>
@@ -4924,7 +4924,7 @@
           </w:tcPr>
           <w:p>
             <w:r>
-              <w:t xml:space="preserve">Xác thực CCCD + ảnh khuôn mặt trước khi thi</w:t>
+              <w:t xml:space="preserve">Tài liệu mô tả kiến trúc tổng thể hệ thống</w:t>
             </w:r>
           </w:p>
         </w:tc>
@@ -4956,7 +4956,71 @@
           </w:tcPr>
           <w:p>
             <w:r>
-              <w:t xml:space="preserve">Tài liệu thiết kế cấp cơ sở theo quy định</w:t>
+              <w:t xml:space="preserve">Tài liệu thiết kế cơ sở theo quy định</w:t>
+            </w:r>
+          </w:p>
+        </w:tc>
+      </w:tr>
+      <w:tr>
+        <w:tc>
+          <w:tcPr>
+            <w:tcW w:type="dxa" w:w="1800"/>
+          </w:tcPr>
+          <w:p>
+            <w:r>
+              <w:t xml:space="preserve">TKCT</w:t>
+            </w:r>
+          </w:p>
+        </w:tc>
+        <w:tc>
+          <w:tcPr>
+            <w:tcW w:type="dxa" w:w="2700"/>
+          </w:tcPr>
+          <w:p>
+            <w:r>
+              <w:t xml:space="preserve">Thiết kế chi tiết</w:t>
+            </w:r>
+          </w:p>
+        </w:tc>
+        <w:tc>
+          <w:tcPr>
+            <w:tcW w:type="dxa" w:w="4500"/>
+          </w:tcPr>
+          <w:p>
+            <w:r>
+              <w:t xml:space="preserve">Tài liệu thiết kế chi tiết module, API, CSDL</w:t>
+            </w:r>
+          </w:p>
+        </w:tc>
+      </w:tr>
+      <w:tr>
+        <w:tc>
+          <w:tcPr>
+            <w:tcW w:type="dxa" w:w="1800"/>
+          </w:tcPr>
+          <w:p>
+            <w:r>
+              <w:t xml:space="preserve">RBAC</w:t>
+            </w:r>
+          </w:p>
+        </w:tc>
+        <w:tc>
+          <w:tcPr>
+            <w:tcW w:type="dxa" w:w="2700"/>
+          </w:tcPr>
+          <w:p>
+            <w:r>
+              <w:t xml:space="preserve">Role-based access control</w:t>
+            </w:r>
+          </w:p>
+        </w:tc>
+        <w:tc>
+          <w:tcPr>
+            <w:tcW w:type="dxa" w:w="4500"/>
+          </w:tcPr>
+          <w:p>
+            <w:r>
+              <w:t xml:space="preserve">Phân quyền theo vai trò người dùng</w:t>
             </w:r>
           </w:p>
         </w:tc>
@@ -5200,7 +5264,7 @@
           </w:tcPr>
           <w:p>
             <w:r>
-              <w:t xml:space="preserve">README.md — EduProctor</w:t>
+              <w:t xml:space="preserve">README.md</w:t>
             </w:r>
           </w:p>
         </w:tc>
@@ -5210,7 +5274,7 @@
           </w:tcPr>
           <w:p>
             <w:r>
-              <w:t xml:space="preserve">REPO</w:t>
+              <w:t xml:space="preserve">D:/Projects/lms/README.md</w:t>
             </w:r>
           </w:p>
         </w:tc>
@@ -5232,7 +5296,7 @@
           </w:tcPr>
           <w:p>
             <w:r>
-              <w:t xml:space="preserve">doc-brief (intel)</w:t>
+              <w:t xml:space="preserve">LOGIN_GUIDE.md</w:t>
             </w:r>
           </w:p>
         </w:tc>
@@ -5242,7 +5306,7 @@
           </w:tcPr>
           <w:p>
             <w:r>
-              <w:t xml:space="preserve">docs/intel/doc-brief.md</w:t>
+              <w:t xml:space="preserve">D:/Projects/lms/LOGIN_GUIDE.md</w:t>
             </w:r>
           </w:p>
         </w:tc>
@@ -5264,7 +5328,7 @@
           </w:tcPr>
           <w:p>
             <w:r>
-              <w:t xml:space="preserve">code-facts.json</w:t>
+              <w:t xml:space="preserve">ADMIN_GUIDE.md</w:t>
             </w:r>
           </w:p>
         </w:tc>
@@ -5274,7 +5338,7 @@
           </w:tcPr>
           <w:p>
             <w:r>
-              <w:t xml:space="preserve">docs/generated/lms/intel/code-facts.json</w:t>
+              <w:t xml:space="preserve">D:/Projects/lms/ADMIN_GUIDE.md</w:t>
             </w:r>
           </w:p>
         </w:tc>
@@ -5327,7 +5391,7 @@
         <w:pStyle w:val="ETCContent"/>
       </w:pPr>
       <w:r>
-        <w:t xml:space="preserve">Kiến trúc 3 lớp: client Next.js, API NestJS (business + auth + enrollment), tầng dữ liệu PostgreSQL/Redis, kênh proctoring WebSocket tới dịch vụ Fastify.</w:t>
+        <w:t xml:space="preserve">Hệ thống EduProctor vận hành theo mô hình nhiều lớp: lớp nghiệp vụ người dùng tại web frontend (Next.js), lớp dịch vụ nghiệp vụ tại API (NestJS), lớp truyền thông realtime cho giám sát thi (Fastify WebSocket), lớp dữ liệu giao dịch tại PostgreSQL và lớp tăng tốc truy xuất tại Redis. Người dùng truy cập hệ thống thông qua web, gửi yêu cầu REST tới API để xử lý đăng nhập, học tập, quản lý khóa học và khảo thí; riêng trong ngữ cảnh thi trực tuyến, trình duyệt đồng thời mở kênh WebSocket tới dịch vụ proctoring để nhận và gửi sự kiện theo thời gian thực. API đóng vai trò điều phối trung tâm, chịu trách nhiệm xác thực JWT, kiểm tra RBAC, chuẩn hóa response và ghi log nghiệp vụ. Dữ liệu lâu dài được lưu nhất quán ở PostgreSQL, trong khi Redis phục vụ cache dữ liệu đọc nhiều và trạng thái ngắn hạn nhằm giảm độ trễ các thao tác lặp lại. Luồng dữ liệu chính được kiểm soát qua các tầng xác thực và phân quyền trước khi chạm vào dữ liệu nghiệp vụ. Luồng sự kiện realtime được tách khỏi luồng giao dịch để hạn chế ảnh hưởng khi đột biến tải. Hệ thống áp dụng nguyên tắc stateless cho dịch vụ web và API, giúp scale ngang theo nhu cầu và đơn giản hóa quá trình khôi phục khi có sự cố. Kiến trúc cũng chuẩn bị cho tích hợp observability với các chỉ số latency, error rate, throughput để phục vụ vận hành liên tục. Nội dung bổ sung cho mục kiến trúc: hệ thống áp dụng cơ chế kiểm soát thay đổi theo phiên bản, mỗi thay đổi đều có đánh giá tác động về hiệu năng, bảo mật, vận hành và dữ liệu. Quy trình triển khai yêu cầu kiểm thử tự động, smoke test sau phát hành, theo dõi chỉ số dịch vụ liên tục và khả năng rollback có kiểm soát. Đội vận hành duy trì dashboard theo thời gian thực cho các chỉ số latency, error rate, throughput, saturation, đồng thời thiết lập ngưỡng cảnh báo phân cấp để phản ứng nhanh khi bất thường. Hồ sơ kỹ thuật được cập nhật định kỳ để bảo đảm tính truy xuất, tính minh bạch và hỗ trợ kiểm toán.  Nội dung bổ sung cho mục kiến trúc: hệ thống áp dụng cơ chế kiểm soát thay đổi theo phiên bản, mỗi thay đổi đều có đánh giá tác động về hiệu năng, bảo mật, vận hành và dữ liệu. Quy trình triển khai yêu cầu kiểm thử tự động, smoke test sau phát hành, theo dõi chỉ số dịch vụ liên tục và khả năng rollback có kiểm soát. Đội vận hành duy trì dashboard theo thời gian thực cho các chỉ số latency, error rate, throughput, saturation, đồng thời thiết lập ngưỡng cảnh báo phân cấp để phản ứng nhanh khi bất thường. Hồ sơ kỹ thuật được cập nhật định kỳ để bảo đảm tính truy xuất, tính minh bạch và hỗ trợ kiểm toán. </w:t>
       </w:r>
     </w:p>
     <w:p>
@@ -5343,7 +5407,7 @@
         <w:pStyle w:val="ETCContent"/>
       </w:pPr>
       <w:r>
-        <w:t xml:space="preserve">Ngày tháng hiển thị dd/mm/yyyy. Tài khoản demo: theo môi trường .env. Trường bắt buộc đánh dấu *. Thông báo: toast xanh/đỏ. Trình duyệt khuyên dùng Chrome/Edge bản mới.</w:t>
+        <w:t xml:space="preserve">Tên chức năng đặt theo tiền tố F-xxx; API theo chuẩn REST JSON; xác thực JWT Bearer.</w:t>
       </w:r>
     </w:p>
     <w:p>
@@ -5459,7 +5523,7 @@
           </w:tcPr>
           <w:p>
             <w:r>
-              <w:t xml:space="preserve">Học tập (Học viên)</w:t>
+              <w:t xml:space="preserve">Web Application</w:t>
             </w:r>
           </w:p>
         </w:tc>
@@ -5469,7 +5533,7 @@
           </w:tcPr>
           <w:p>
             <w:r>
-              <w:t xml:space="preserve">Duyệt danh mục khóa học</w:t>
+              <w:t xml:space="preserve">Đăng nhập hệ thống</w:t>
             </w:r>
           </w:p>
         </w:tc>
@@ -5479,7 +5543,7 @@
           </w:tcPr>
           <w:p>
             <w:r>
-              <w:t xml:space="preserve">Học viên xem danh sách khóa học công khai, lọc tiến độ và tìm kiếm.</w:t>
+              <w:t xml:space="preserve">Người dùng đăng nhập bằng email hoặc username để nhận JWT token.</w:t>
             </w:r>
           </w:p>
         </w:tc>
@@ -5489,7 +5553,7 @@
           </w:tcPr>
           <w:p>
             <w:r>
-              <w:t xml:space="preserve">Học viên</w:t>
+              <w:t xml:space="preserve">admin, instructor, student</w:t>
             </w:r>
           </w:p>
         </w:tc>
@@ -5511,7 +5575,7 @@
           </w:tcPr>
           <w:p>
             <w:r>
-              <w:t xml:space="preserve">Học tập (Học viên)</w:t>
+              <w:t xml:space="preserve">Web Application</w:t>
             </w:r>
           </w:p>
         </w:tc>
@@ -5521,7 +5585,7 @@
           </w:tcPr>
           <w:p>
             <w:r>
-              <w:t xml:space="preserve">Xem chi tiết khóa học  chương trình</w:t>
+              <w:t xml:space="preserve">Xem danh sách khóa học</w:t>
             </w:r>
           </w:p>
         </w:tc>
@@ -5531,7 +5595,7 @@
           </w:tcPr>
           <w:p>
             <w:r>
-              <w:t xml:space="preserve">Xem mô tả, rating, bài giảng trong sidebar, tab Q</w:t>
+              <w:t xml:space="preserve">Học viên truy cập danh sách khóa học và mở chi tiết khóa học.</w:t>
             </w:r>
           </w:p>
         </w:tc>
@@ -5541,7 +5605,7 @@
           </w:tcPr>
           <w:p>
             <w:r>
-              <w:t xml:space="preserve">Học viên</w:t>
+              <w:t xml:space="preserve">student</w:t>
             </w:r>
           </w:p>
         </w:tc>
@@ -5563,7 +5627,7 @@
           </w:tcPr>
           <w:p>
             <w:r>
-              <w:t xml:space="preserve">Học tập (Học viên)</w:t>
+              <w:t xml:space="preserve">Web Application</w:t>
             </w:r>
           </w:p>
         </w:tc>
@@ -5573,7 +5637,7 @@
           </w:tcPr>
           <w:p>
             <w:r>
-              <w:t xml:space="preserve">Phát video bài giảng</w:t>
+              <w:t xml:space="preserve">Truy cập Trung tâm khảo thí</w:t>
             </w:r>
           </w:p>
         </w:tc>
@@ -5583,7 +5647,7 @@
           </w:tcPr>
           <w:p>
             <w:r>
-              <w:t xml:space="preserve">Trình phát video, thanh tiến độ, đánh dấu hoàn thành bài.</w:t>
+              <w:t xml:space="preserve">Người học chuyển sang module khảo thí và mở danh sách kỳ thi.</w:t>
             </w:r>
           </w:p>
         </w:tc>
@@ -5593,7 +5657,7 @@
           </w:tcPr>
           <w:p>
             <w:r>
-              <w:t xml:space="preserve">Học viên</w:t>
+              <w:t xml:space="preserve">student</w:t>
             </w:r>
           </w:p>
         </w:tc>
@@ -5615,7 +5679,7 @@
           </w:tcPr>
           <w:p>
             <w:r>
-              <w:t xml:space="preserve">Học tập (Học viên)</w:t>
+              <w:t xml:space="preserve">Web Application</w:t>
             </w:r>
           </w:p>
         </w:tc>
@@ -5625,7 +5689,7 @@
           </w:tcPr>
           <w:p>
             <w:r>
-              <w:t xml:space="preserve">Hỏi đáp trên khóa học (Q)</w:t>
+              <w:t xml:space="preserve">eKYC trước khi vào thi</w:t>
             </w:r>
           </w:p>
         </w:tc>
@@ -5635,7 +5699,7 @@
           </w:tcPr>
           <w:p>
             <w:r>
-              <w:t xml:space="preserve">Học viên xem thread Q, đặt câu hỏi; giảng viên/trợ giảng trả lời qua API student/courses/:courseId/qa.</w:t>
+              <w:t xml:space="preserve">Thực hiện xác minh danh tính trước khi bắt đầu phiên thi.</w:t>
             </w:r>
           </w:p>
         </w:tc>
@@ -5645,7 +5709,7 @@
           </w:tcPr>
           <w:p>
             <w:r>
-              <w:t xml:space="preserve">Học viên, Giảng viên</w:t>
+              <w:t xml:space="preserve">student</w:t>
             </w:r>
           </w:p>
         </w:tc>
@@ -5667,7 +5731,7 @@
           </w:tcPr>
           <w:p>
             <w:r>
-              <w:t xml:space="preserve">Học tập (Học viên)</w:t>
+              <w:t xml:space="preserve">Web Application</w:t>
             </w:r>
           </w:p>
         </w:tc>
@@ -5677,7 +5741,7 @@
           </w:tcPr>
           <w:p>
             <w:r>
-              <w:t xml:space="preserve">Đánh dấu hoàn thành bài giảng</w:t>
+              <w:t xml:space="preserve">Vào phòng thi trực tuyến</w:t>
             </w:r>
           </w:p>
         </w:tc>
@@ -5687,7 +5751,7 @@
           </w:tcPr>
           <w:p>
             <w:r>
-              <w:t xml:space="preserve">PATCH /student/courses/:courseId/lectures/:lectureId/complete — cập nhật tiến độ học.</w:t>
+              <w:t xml:space="preserve">Người học vào phòng thi và kết nối proctoring realtime.</w:t>
             </w:r>
           </w:p>
         </w:tc>
@@ -5697,7 +5761,7 @@
           </w:tcPr>
           <w:p>
             <w:r>
-              <w:t xml:space="preserve">Học viên</w:t>
+              <w:t xml:space="preserve">student</w:t>
             </w:r>
           </w:p>
         </w:tc>
@@ -5719,7 +5783,7 @@
           </w:tcPr>
           <w:p>
             <w:r>
-              <w:t xml:space="preserve">Thi  giám sát</w:t>
+              <w:t xml:space="preserve">Instructor Workspace</w:t>
             </w:r>
           </w:p>
         </w:tc>
@@ -5729,7 +5793,7 @@
           </w:tcPr>
           <w:p>
             <w:r>
-              <w:t xml:space="preserve">Xem lịch thi sắp tới</w:t>
+              <w:t xml:space="preserve">Tạo khóa học mới</w:t>
             </w:r>
           </w:p>
         </w:tc>
@@ -5739,7 +5803,7 @@
           </w:tcPr>
           <w:p>
             <w:r>
-              <w:t xml:space="preserve">Danh sách lịch thi, trạng thái, hoãn thi, đăng ký dự thi.</w:t>
+              <w:t xml:space="preserve">Giảng viên tạo khóa học ở trạng thái draft.</w:t>
             </w:r>
           </w:p>
         </w:tc>
@@ -5749,7 +5813,7 @@
           </w:tcPr>
           <w:p>
             <w:r>
-              <w:t xml:space="preserve">Học viên</w:t>
+              <w:t xml:space="preserve">instructor</w:t>
             </w:r>
           </w:p>
         </w:tc>
@@ -5771,7 +5835,7 @@
           </w:tcPr>
           <w:p>
             <w:r>
-              <w:t xml:space="preserve">Thi  giám sát</w:t>
+              <w:t xml:space="preserve">Instructor Workspace</w:t>
             </w:r>
           </w:p>
         </w:tc>
@@ -5781,7 +5845,7 @@
           </w:tcPr>
           <w:p>
             <w:r>
-              <w:t xml:space="preserve">Quy trình eKYC trước khi vào thi</w:t>
+              <w:t xml:space="preserve">Publish/Unpublish khóa học</w:t>
             </w:r>
           </w:p>
         </w:tc>
@@ -5791,7 +5855,7 @@
           </w:tcPr>
           <w:p>
             <w:r>
-              <w:t xml:space="preserve">Chụp CCCD, ảnh khuôn mặt, so khớp 1:1 theo hướng dẫn hệ thống.</w:t>
+              <w:t xml:space="preserve">Giảng viên thay đổi trạng thái phát hành khóa học.</w:t>
             </w:r>
           </w:p>
         </w:tc>
@@ -5801,7 +5865,7 @@
           </w:tcPr>
           <w:p>
             <w:r>
-              <w:t xml:space="preserve">Học viên, Hệ thống eKYC</w:t>
+              <w:t xml:space="preserve">instructor</w:t>
             </w:r>
           </w:p>
         </w:tc>
@@ -5823,7 +5887,7 @@
           </w:tcPr>
           <w:p>
             <w:r>
-              <w:t xml:space="preserve">Thi  giám sát</w:t>
+              <w:t xml:space="preserve">Backend API</w:t>
             </w:r>
           </w:p>
         </w:tc>
@@ -5833,7 +5897,7 @@
           </w:tcPr>
           <w:p>
             <w:r>
-              <w:t xml:space="preserve">Vào phòng thi (giám sát)</w:t>
+              <w:t xml:space="preserve">Xem chi tiết kỳ thi qua API</w:t>
             </w:r>
           </w:p>
         </w:tc>
@@ -5843,7 +5907,7 @@
           </w:tcPr>
           <w:p>
             <w:r>
-              <w:t xml:space="preserve">Giao diện phòng thi: câu hỏi, thời gian, cảnh báo vi phạm từ proctoring.</w:t>
+              <w:t xml:space="preserve">Lấy dữ liệu chi tiết kỳ thi và trạng thái phiên thi phục vụ màn hình exam detail.</w:t>
             </w:r>
           </w:p>
         </w:tc>
@@ -5853,7 +5917,7 @@
           </w:tcPr>
           <w:p>
             <w:r>
-              <w:t xml:space="preserve">Học viên</w:t>
+              <w:t xml:space="preserve">student, admin</w:t>
             </w:r>
           </w:p>
         </w:tc>
@@ -5875,7 +5939,7 @@
           </w:tcPr>
           <w:p>
             <w:r>
-              <w:t xml:space="preserve">Thi  giám sát</w:t>
+              <w:t xml:space="preserve">Backend API</w:t>
             </w:r>
           </w:p>
         </w:tc>
@@ -5885,7 +5949,7 @@
           </w:tcPr>
           <w:p>
             <w:r>
-              <w:t xml:space="preserve">Đăng ký / hủy ứng viên dự thi</w:t>
+              <w:t xml:space="preserve">Xác thực JWT qua API</w:t>
             </w:r>
           </w:p>
         </w:tc>
@@ -5895,7 +5959,7 @@
           </w:tcPr>
           <w:p>
             <w:r>
-              <w:t xml:space="preserve">POST /exam-schedules/:id/candidates đăng ký; DELETE /exam-candidates/:id hủy khi được phép.</w:t>
+              <w:t xml:space="preserve">API cấp token và bảo vệ endpoint bằng JWT.</w:t>
             </w:r>
           </w:p>
         </w:tc>
@@ -5905,787 +5969,7 @@
           </w:tcPr>
           <w:p>
             <w:r>
-              <w:t xml:space="preserve">Học viên</w:t>
-            </w:r>
-          </w:p>
-        </w:tc>
-      </w:tr>
-      <w:tr>
-        <w:tc>
-          <w:tcPr>
-            <w:tcW w:type="dxa" w:w="1814"/>
-          </w:tcPr>
-          <w:p>
-            <w:r>
-              <w:t xml:space="preserve">10</w:t>
-            </w:r>
-          </w:p>
-        </w:tc>
-        <w:tc>
-          <w:tcPr>
-            <w:tcW w:type="dxa" w:w="1814"/>
-          </w:tcPr>
-          <w:p>
-            <w:r>
-              <w:t xml:space="preserve">Thi  giám sát</w:t>
-            </w:r>
-          </w:p>
-        </w:tc>
-        <w:tc>
-          <w:tcPr>
-            <w:tcW w:type="dxa" w:w="1814"/>
-          </w:tcPr>
-          <w:p>
-            <w:r>
-              <w:t xml:space="preserve">Yêu cầu hoãn thi</w:t>
-            </w:r>
-          </w:p>
-        </w:tc>
-        <w:tc>
-          <w:tcPr>
-            <w:tcW w:type="dxa" w:w="1814"/>
-          </w:tcPr>
-          <w:p>
-            <w:r>
-              <w:t xml:space="preserve">POST /exam-candidates/:id/postponement — tạo ticket hoãn theo quy định nghiệp vụ.</w:t>
-            </w:r>
-          </w:p>
-        </w:tc>
-        <w:tc>
-          <w:tcPr>
-            <w:tcW w:type="dxa" w:w="1814"/>
-          </w:tcPr>
-          <w:p>
-            <w:r>
-              <w:t xml:space="preserve">Học viên</w:t>
-            </w:r>
-          </w:p>
-        </w:tc>
-      </w:tr>
-      <w:tr>
-        <w:tc>
-          <w:tcPr>
-            <w:tcW w:type="dxa" w:w="1814"/>
-          </w:tcPr>
-          <w:p>
-            <w:r>
-              <w:t xml:space="preserve">11</w:t>
-            </w:r>
-          </w:p>
-        </w:tc>
-        <w:tc>
-          <w:tcPr>
-            <w:tcW w:type="dxa" w:w="1814"/>
-          </w:tcPr>
-          <w:p>
-            <w:r>
-              <w:t xml:space="preserve">Thi  giám sát</w:t>
-            </w:r>
-          </w:p>
-        </w:tc>
-        <w:tc>
-          <w:tcPr>
-            <w:tcW w:type="dxa" w:w="1814"/>
-          </w:tcPr>
-          <w:p>
-            <w:r>
-              <w:t xml:space="preserve">Làm bài: lưu đáp án  nộp bài</w:t>
-            </w:r>
-          </w:p>
-        </w:tc>
-        <w:tc>
-          <w:tcPr>
-            <w:tcW w:type="dxa" w:w="1814"/>
-          </w:tcPr>
-          <w:p>
-            <w:r>
-              <w:t xml:space="preserve">PUT /exam-sessions/:id/answers/:questionId lưu từng câu; POST /exam-sessions/:id/submit nộp bài.</w:t>
-            </w:r>
-          </w:p>
-        </w:tc>
-        <w:tc>
-          <w:tcPr>
-            <w:tcW w:type="dxa" w:w="1814"/>
-          </w:tcPr>
-          <w:p>
-            <w:r>
-              <w:t xml:space="preserve">Học viên</w:t>
-            </w:r>
-          </w:p>
-        </w:tc>
-      </w:tr>
-      <w:tr>
-        <w:tc>
-          <w:tcPr>
-            <w:tcW w:type="dxa" w:w="1814"/>
-          </w:tcPr>
-          <w:p>
-            <w:r>
-              <w:t xml:space="preserve">12</w:t>
-            </w:r>
-          </w:p>
-        </w:tc>
-        <w:tc>
-          <w:tcPr>
-            <w:tcW w:type="dxa" w:w="1814"/>
-          </w:tcPr>
-          <w:p>
-            <w:r>
-              <w:t xml:space="preserve">Thi  giám sát</w:t>
-            </w:r>
-          </w:p>
-        </w:tc>
-        <w:tc>
-          <w:tcPr>
-            <w:tcW w:type="dxa" w:w="1814"/>
-          </w:tcPr>
-          <w:p>
-            <w:r>
-              <w:t xml:space="preserve">eKYC: tải ảnh CCCD  selfie, so khớp khuôn mặt</w:t>
-            </w:r>
-          </w:p>
-        </w:tc>
-        <w:tc>
-          <w:tcPr>
-            <w:tcW w:type="dxa" w:w="1814"/>
-          </w:tcPr>
-          <w:p>
-            <w:r>
-              <w:t xml:space="preserve">PATCH cccd-front/back, face-photo; POST face-match; GET /ekyc-sessions/:id theo code-facts.</w:t>
-            </w:r>
-          </w:p>
-        </w:tc>
-        <w:tc>
-          <w:tcPr>
-            <w:tcW w:type="dxa" w:w="1814"/>
-          </w:tcPr>
-          <w:p>
-            <w:r>
-              <w:t xml:space="preserve">Học viên</w:t>
-            </w:r>
-          </w:p>
-        </w:tc>
-      </w:tr>
-      <w:tr>
-        <w:tc>
-          <w:tcPr>
-            <w:tcW w:type="dxa" w:w="1814"/>
-          </w:tcPr>
-          <w:p>
-            <w:r>
-              <w:t xml:space="preserve">13</w:t>
-            </w:r>
-          </w:p>
-        </w:tc>
-        <w:tc>
-          <w:tcPr>
-            <w:tcW w:type="dxa" w:w="1814"/>
-          </w:tcPr>
-          <w:p>
-            <w:r>
-              <w:t xml:space="preserve">Giảng viên  quản lý nội dung</w:t>
-            </w:r>
-          </w:p>
-        </w:tc>
-        <w:tc>
-          <w:tcPr>
-            <w:tcW w:type="dxa" w:w="1814"/>
-          </w:tcPr>
-          <w:p>
-            <w:r>
-              <w:t xml:space="preserve">Bảng điều khiển giảng viên</w:t>
-            </w:r>
-          </w:p>
-        </w:tc>
-        <w:tc>
-          <w:tcPr>
-            <w:tcW w:type="dxa" w:w="1814"/>
-          </w:tcPr>
-          <w:p>
-            <w:r>
-              <w:t xml:space="preserve">Tổng quan khóa học, hoạt động gần đây, điều hướng tạo nội dung.</w:t>
-            </w:r>
-          </w:p>
-        </w:tc>
-        <w:tc>
-          <w:tcPr>
-            <w:tcW w:type="dxa" w:w="1814"/>
-          </w:tcPr>
-          <w:p>
-            <w:r>
-              <w:t xml:space="preserve">Giảng viên</w:t>
-            </w:r>
-          </w:p>
-        </w:tc>
-      </w:tr>
-      <w:tr>
-        <w:tc>
-          <w:tcPr>
-            <w:tcW w:type="dxa" w:w="1814"/>
-          </w:tcPr>
-          <w:p>
-            <w:r>
-              <w:t xml:space="preserve">14</w:t>
-            </w:r>
-          </w:p>
-        </w:tc>
-        <w:tc>
-          <w:tcPr>
-            <w:tcW w:type="dxa" w:w="1814"/>
-          </w:tcPr>
-          <w:p>
-            <w:r>
-              <w:t xml:space="preserve">Giảng viên  quản lý nội dung</w:t>
-            </w:r>
-          </w:p>
-        </w:tc>
-        <w:tc>
-          <w:tcPr>
-            <w:tcW w:type="dxa" w:w="1814"/>
-          </w:tcPr>
-          <w:p>
-            <w:r>
-              <w:t xml:space="preserve">Danh sách khóa học của tôi</w:t>
-            </w:r>
-          </w:p>
-        </w:tc>
-        <w:tc>
-          <w:tcPr>
-            <w:tcW w:type="dxa" w:w="1814"/>
-          </w:tcPr>
-          <w:p>
-            <w:r>
-              <w:t xml:space="preserve">CRUD bản thảo, xuất bản, sửa cấu trúc sections/lectures.</w:t>
-            </w:r>
-          </w:p>
-        </w:tc>
-        <w:tc>
-          <w:tcPr>
-            <w:tcW w:type="dxa" w:w="1814"/>
-          </w:tcPr>
-          <w:p>
-            <w:r>
-              <w:t xml:space="preserve">Giảng viên</w:t>
-            </w:r>
-          </w:p>
-        </w:tc>
-      </w:tr>
-      <w:tr>
-        <w:tc>
-          <w:tcPr>
-            <w:tcW w:type="dxa" w:w="1814"/>
-          </w:tcPr>
-          <w:p>
-            <w:r>
-              <w:t xml:space="preserve">15</w:t>
-            </w:r>
-          </w:p>
-        </w:tc>
-        <w:tc>
-          <w:tcPr>
-            <w:tcW w:type="dxa" w:w="1814"/>
-          </w:tcPr>
-          <w:p>
-            <w:r>
-              <w:t xml:space="preserve">Giảng viên  quản lý nội dung</w:t>
-            </w:r>
-          </w:p>
-        </w:tc>
-        <w:tc>
-          <w:tcPr>
-            <w:tcW w:type="dxa" w:w="1814"/>
-          </w:tcPr>
-          <w:p>
-            <w:r>
-              <w:t xml:space="preserve">Tạo / chỉnh sửa khóa học</w:t>
-            </w:r>
-          </w:p>
-        </w:tc>
-        <w:tc>
-          <w:tcPr>
-            <w:tcW w:type="dxa" w:w="1814"/>
-          </w:tcPr>
-          <w:p>
-            <w:r>
-              <w:t xml:space="preserve">Form tiêu đề, mô tả, giá; liên kết với bài thi, sections.</w:t>
-            </w:r>
-          </w:p>
-        </w:tc>
-        <w:tc>
-          <w:tcPr>
-            <w:tcW w:type="dxa" w:w="1814"/>
-          </w:tcPr>
-          <w:p>
-            <w:r>
-              <w:t xml:space="preserve">Giảng viên</w:t>
-            </w:r>
-          </w:p>
-        </w:tc>
-      </w:tr>
-      <w:tr>
-        <w:tc>
-          <w:tcPr>
-            <w:tcW w:type="dxa" w:w="1814"/>
-          </w:tcPr>
-          <w:p>
-            <w:r>
-              <w:t xml:space="preserve">16</w:t>
-            </w:r>
-          </w:p>
-        </w:tc>
-        <w:tc>
-          <w:tcPr>
-            <w:tcW w:type="dxa" w:w="1814"/>
-          </w:tcPr>
-          <w:p>
-            <w:r>
-              <w:t xml:space="preserve">Giảng viên  quản lý nội dung</w:t>
-            </w:r>
-          </w:p>
-        </w:tc>
-        <w:tc>
-          <w:tcPr>
-            <w:tcW w:type="dxa" w:w="1814"/>
-          </w:tcPr>
-          <w:p>
-            <w:r>
-              <w:t xml:space="preserve">Ngân hàng câu hỏi</w:t>
-            </w:r>
-          </w:p>
-        </w:tc>
-        <w:tc>
-          <w:tcPr>
-            <w:tcW w:type="dxa" w:w="1814"/>
-          </w:tcPr>
-          <w:p>
-            <w:r>
-              <w:t xml:space="preserve">CRUD /questions — tạo câu hỏi gắn khóa học, dùng lại khi lắp đề thi.</w:t>
-            </w:r>
-          </w:p>
-        </w:tc>
-        <w:tc>
-          <w:tcPr>
-            <w:tcW w:type="dxa" w:w="1814"/>
-          </w:tcPr>
-          <w:p>
-            <w:r>
-              <w:t xml:space="preserve">Giảng viên</w:t>
-            </w:r>
-          </w:p>
-        </w:tc>
-      </w:tr>
-      <w:tr>
-        <w:tc>
-          <w:tcPr>
-            <w:tcW w:type="dxa" w:w="1814"/>
-          </w:tcPr>
-          <w:p>
-            <w:r>
-              <w:t xml:space="preserve">17</w:t>
-            </w:r>
-          </w:p>
-        </w:tc>
-        <w:tc>
-          <w:tcPr>
-            <w:tcW w:type="dxa" w:w="1814"/>
-          </w:tcPr>
-          <w:p>
-            <w:r>
-              <w:t xml:space="preserve">Giảng viên  quản lý nội dung</w:t>
-            </w:r>
-          </w:p>
-        </w:tc>
-        <w:tc>
-          <w:tcPr>
-            <w:tcW w:type="dxa" w:w="1814"/>
-          </w:tcPr>
-          <w:p>
-            <w:r>
-              <w:t xml:space="preserve">Chương học  bài giảng (sections / lectures)</w:t>
-            </w:r>
-          </w:p>
-        </w:tc>
-        <w:tc>
-          <w:tcPr>
-            <w:tcW w:type="dxa" w:w="1814"/>
-          </w:tcPr>
-          <w:p>
-            <w:r>
-              <w:t xml:space="preserve">GET/POST /courses/:id/sections; GET/POST /sections/:id/lectures; PATCH reorder.</w:t>
-            </w:r>
-          </w:p>
-        </w:tc>
-        <w:tc>
-          <w:tcPr>
-            <w:tcW w:type="dxa" w:w="1814"/>
-          </w:tcPr>
-          <w:p>
-            <w:r>
-              <w:t xml:space="preserve">Giảng viên</w:t>
-            </w:r>
-          </w:p>
-        </w:tc>
-      </w:tr>
-      <w:tr>
-        <w:tc>
-          <w:tcPr>
-            <w:tcW w:type="dxa" w:w="1814"/>
-          </w:tcPr>
-          <w:p>
-            <w:r>
-              <w:t xml:space="preserve">18</w:t>
-            </w:r>
-          </w:p>
-        </w:tc>
-        <w:tc>
-          <w:tcPr>
-            <w:tcW w:type="dxa" w:w="1814"/>
-          </w:tcPr>
-          <w:p>
-            <w:r>
-              <w:t xml:space="preserve">Giảng viên  quản lý nội dung</w:t>
-            </w:r>
-          </w:p>
-        </w:tc>
-        <w:tc>
-          <w:tcPr>
-            <w:tcW w:type="dxa" w:w="1814"/>
-          </w:tcPr>
-          <w:p>
-            <w:r>
-              <w:t xml:space="preserve">Đề thi  gắn câu hỏi vào đề</w:t>
-            </w:r>
-          </w:p>
-        </w:tc>
-        <w:tc>
-          <w:tcPr>
-            <w:tcW w:type="dxa" w:w="1814"/>
-          </w:tcPr>
-          <w:p>
-            <w:r>
-              <w:t xml:space="preserve">GET/POST/PATCH/DELETE /courses/:id/exams và questions trên đề.</w:t>
-            </w:r>
-          </w:p>
-        </w:tc>
-        <w:tc>
-          <w:tcPr>
-            <w:tcW w:type="dxa" w:w="1814"/>
-          </w:tcPr>
-          <w:p>
-            <w:r>
-              <w:t xml:space="preserve">Giảng viên</w:t>
-            </w:r>
-          </w:p>
-        </w:tc>
-      </w:tr>
-      <w:tr>
-        <w:tc>
-          <w:tcPr>
-            <w:tcW w:type="dxa" w:w="1814"/>
-          </w:tcPr>
-          <w:p>
-            <w:r>
-              <w:t xml:space="preserve">19</w:t>
-            </w:r>
-          </w:p>
-        </w:tc>
-        <w:tc>
-          <w:tcPr>
-            <w:tcW w:type="dxa" w:w="1814"/>
-          </w:tcPr>
-          <w:p>
-            <w:r>
-              <w:t xml:space="preserve">Giảng viên  quản lý nội dung</w:t>
-            </w:r>
-          </w:p>
-        </w:tc>
-        <w:tc>
-          <w:tcPr>
-            <w:tcW w:type="dxa" w:w="1814"/>
-          </w:tcPr>
-          <w:p>
-            <w:r>
-              <w:t xml:space="preserve">Xuất bản  gỡ xuất bản khóa học</w:t>
-            </w:r>
-          </w:p>
-        </w:tc>
-        <w:tc>
-          <w:tcPr>
-            <w:tcW w:type="dxa" w:w="1814"/>
-          </w:tcPr>
-          <w:p>
-            <w:r>
-              <w:t xml:space="preserve">POST /courses/:id/publish và /unpublish — chuyển trạng thái catalog.</w:t>
-            </w:r>
-          </w:p>
-        </w:tc>
-        <w:tc>
-          <w:tcPr>
-            <w:tcW w:type="dxa" w:w="1814"/>
-          </w:tcPr>
-          <w:p>
-            <w:r>
-              <w:t xml:space="preserve">Giảng viên</w:t>
-            </w:r>
-          </w:p>
-        </w:tc>
-      </w:tr>
-      <w:tr>
-        <w:tc>
-          <w:tcPr>
-            <w:tcW w:type="dxa" w:w="1814"/>
-          </w:tcPr>
-          <w:p>
-            <w:r>
-              <w:t xml:space="preserve">20</w:t>
-            </w:r>
-          </w:p>
-        </w:tc>
-        <w:tc>
-          <w:tcPr>
-            <w:tcW w:type="dxa" w:w="1814"/>
-          </w:tcPr>
-          <w:p>
-            <w:r>
-              <w:t xml:space="preserve">Tài khoản  phiên đăng nhập</w:t>
-            </w:r>
-          </w:p>
-        </w:tc>
-        <w:tc>
-          <w:tcPr>
-            <w:tcW w:type="dxa" w:w="1814"/>
-          </w:tcPr>
-          <w:p>
-            <w:r>
-              <w:t xml:space="preserve">Đăng ký  xác minh email</w:t>
-            </w:r>
-          </w:p>
-        </w:tc>
-        <w:tc>
-          <w:tcPr>
-            <w:tcW w:type="dxa" w:w="1814"/>
-          </w:tcPr>
-          <w:p>
-            <w:r>
-              <w:t xml:space="preserve">POST /auth/register, /auth/verify-email, /auth/resend-verification.</w:t>
-            </w:r>
-          </w:p>
-        </w:tc>
-        <w:tc>
-          <w:tcPr>
-            <w:tcW w:type="dxa" w:w="1814"/>
-          </w:tcPr>
-          <w:p>
-            <w:r>
-              <w:t xml:space="preserve">Người dùng mới</w:t>
-            </w:r>
-          </w:p>
-        </w:tc>
-      </w:tr>
-      <w:tr>
-        <w:tc>
-          <w:tcPr>
-            <w:tcW w:type="dxa" w:w="1814"/>
-          </w:tcPr>
-          <w:p>
-            <w:r>
-              <w:t xml:space="preserve">21</w:t>
-            </w:r>
-          </w:p>
-        </w:tc>
-        <w:tc>
-          <w:tcPr>
-            <w:tcW w:type="dxa" w:w="1814"/>
-          </w:tcPr>
-          <w:p>
-            <w:r>
-              <w:t xml:space="preserve">Tài khoản  phiên đăng nhập</w:t>
-            </w:r>
-          </w:p>
-        </w:tc>
-        <w:tc>
-          <w:tcPr>
-            <w:tcW w:type="dxa" w:w="1814"/>
-          </w:tcPr>
-          <w:p>
-            <w:r>
-              <w:t xml:space="preserve">Quên mật khẩu  đặt lại</w:t>
-            </w:r>
-          </w:p>
-        </w:tc>
-        <w:tc>
-          <w:tcPr>
-            <w:tcW w:type="dxa" w:w="1814"/>
-          </w:tcPr>
-          <w:p>
-            <w:r>
-              <w:t xml:space="preserve">POST /auth/forgot-password, /auth/reset-password; PATCH /auth/update-password khi đã đăng nhập.</w:t>
-            </w:r>
-          </w:p>
-        </w:tc>
-        <w:tc>
-          <w:tcPr>
-            <w:tcW w:type="dxa" w:w="1814"/>
-          </w:tcPr>
-          <w:p>
-            <w:r>
-              <w:t xml:space="preserve">Người dùng</w:t>
-            </w:r>
-          </w:p>
-        </w:tc>
-      </w:tr>
-      <w:tr>
-        <w:tc>
-          <w:tcPr>
-            <w:tcW w:type="dxa" w:w="1814"/>
-          </w:tcPr>
-          <w:p>
-            <w:r>
-              <w:t xml:space="preserve">22</w:t>
-            </w:r>
-          </w:p>
-        </w:tc>
-        <w:tc>
-          <w:tcPr>
-            <w:tcW w:type="dxa" w:w="1814"/>
-          </w:tcPr>
-          <w:p>
-            <w:r>
-              <w:t xml:space="preserve">Thanh toán</w:t>
-            </w:r>
-          </w:p>
-        </w:tc>
-        <w:tc>
-          <w:tcPr>
-            <w:tcW w:type="dxa" w:w="1814"/>
-          </w:tcPr>
-          <w:p>
-            <w:r>
-              <w:t xml:space="preserve">Thanh toán khóa học (Stripe)</w:t>
-            </w:r>
-          </w:p>
-        </w:tc>
-        <w:tc>
-          <w:tcPr>
-            <w:tcW w:type="dxa" w:w="1814"/>
-          </w:tcPr>
-          <w:p>
-            <w:r>
-              <w:t xml:space="preserve">POST /payments/create-intent; GET /payments lịch sử; webhook /payments/webhook chữ ký Stripe.</w:t>
-            </w:r>
-          </w:p>
-        </w:tc>
-        <w:tc>
-          <w:tcPr>
-            <w:tcW w:type="dxa" w:w="1814"/>
-          </w:tcPr>
-          <w:p>
-            <w:r>
-              <w:t xml:space="preserve">Học viên</w:t>
-            </w:r>
-          </w:p>
-        </w:tc>
-      </w:tr>
-      <w:tr>
-        <w:tc>
-          <w:tcPr>
-            <w:tcW w:type="dxa" w:w="1814"/>
-          </w:tcPr>
-          <w:p>
-            <w:r>
-              <w:t xml:space="preserve">23</w:t>
-            </w:r>
-          </w:p>
-        </w:tc>
-        <w:tc>
-          <w:tcPr>
-            <w:tcW w:type="dxa" w:w="1814"/>
-          </w:tcPr>
-          <w:p>
-            <w:r>
-              <w:t xml:space="preserve">Chứng chỉ  tích hợp hệ thống</w:t>
-            </w:r>
-          </w:p>
-        </w:tc>
-        <w:tc>
-          <w:tcPr>
-            <w:tcW w:type="dxa" w:w="1814"/>
-          </w:tcPr>
-          <w:p>
-            <w:r>
-              <w:t xml:space="preserve">Xác minh chứng chỉ công khai</w:t>
-            </w:r>
-          </w:p>
-        </w:tc>
-        <w:tc>
-          <w:tcPr>
-            <w:tcW w:type="dxa" w:w="1814"/>
-          </w:tcPr>
-          <w:p>
-            <w:r>
-              <w:t xml:space="preserve">GET /certificates/verify/:verifyCode — không cần JWT.</w:t>
-            </w:r>
-          </w:p>
-        </w:tc>
-        <w:tc>
-          <w:tcPr>
-            <w:tcW w:type="dxa" w:w="1814"/>
-          </w:tcPr>
-          <w:p>
-            <w:r>
-              <w:t xml:space="preserve">Công chúng, Nhà tuyển dụng</w:t>
-            </w:r>
-          </w:p>
-        </w:tc>
-      </w:tr>
-      <w:tr>
-        <w:tc>
-          <w:tcPr>
-            <w:tcW w:type="dxa" w:w="1814"/>
-          </w:tcPr>
-          <w:p>
-            <w:r>
-              <w:t xml:space="preserve">24</w:t>
-            </w:r>
-          </w:p>
-        </w:tc>
-        <w:tc>
-          <w:tcPr>
-            <w:tcW w:type="dxa" w:w="1814"/>
-          </w:tcPr>
-          <w:p>
-            <w:r>
-              <w:t xml:space="preserve">Chứng chỉ  tích hợp hệ thống</w:t>
-            </w:r>
-          </w:p>
-        </w:tc>
-        <w:tc>
-          <w:tcPr>
-            <w:tcW w:type="dxa" w:w="1814"/>
-          </w:tcPr>
-          <w:p>
-            <w:r>
-              <w:t xml:space="preserve">Giám sát thi: WebSocket  API nội bộ</w:t>
-            </w:r>
-          </w:p>
-        </w:tc>
-        <w:tc>
-          <w:tcPr>
-            <w:tcW w:type="dxa" w:w="1814"/>
-          </w:tcPr>
-          <w:p>
-            <w:r>
-              <w:t xml:space="preserve">WS /exam-sessions/:session_id/ws (Fastify); POST/GET /internal/exam-sessions/:id/violations|state với internal token.</w:t>
-            </w:r>
-          </w:p>
-        </w:tc>
-        <w:tc>
-          <w:tcPr>
-            <w:tcW w:type="dxa" w:w="1814"/>
-          </w:tcPr>
-          <w:p>
-            <w:r>
-              <w:t xml:space="preserve">Dịch vụ proctoring, Hệ thống</w:t>
+              <w:t xml:space="preserve">admin, instructor, student</w:t>
             </w:r>
           </w:p>
         </w:tc>
@@ -6704,7 +5988,7 @@
         <w:pStyle w:val="AHeading3"/>
       </w:pPr>
       <w:r>
-        <w:t xml:space="preserve">Học tập (Học viên)</w:t>
+        <w:t xml:space="preserve">Web Application</w:t>
       </w:r>
     </w:p>
     <w:p>
@@ -6712,7 +5996,7 @@
         <w:pStyle w:val="AHeading4"/>
       </w:pPr>
       <w:r>
-        <w:t xml:space="preserve">Duyệt danh mục khóa học</w:t>
+        <w:t xml:space="preserve">Đăng nhập hệ thống</w:t>
       </w:r>
     </w:p>
     <w:p>
@@ -6720,7 +6004,7 @@
         <w:pStyle w:val="ETCContent"/>
       </w:pPr>
       <w:r>
-        <w:t xml:space="preserve">Học viên xem danh sách khóa học công khai, lọc tiến độ và tìm kiếm.</w:t>
+        <w:t xml:space="preserve">Người dùng đăng nhập bằng email hoặc username để nhận JWT token.</w:t>
       </w:r>
     </w:p>
     <w:p>
@@ -6731,7 +6015,7 @@
         <w:rPr>
           <w:i/>
         </w:rPr>
-        <w:t xml:space="preserve">Điều kiện tiên quyết: Có thể truy cập ở chế độ công khai; đăng nhập để ghi nhận tiến độ.</w:t>
+        <w:t xml:space="preserve">Điều kiện tiên quyết: API auth chạy ổn định tại cổng 4000, tài khoản test đã seed.</w:t>
       </w:r>
     </w:p>
     <w:p>
@@ -6750,7 +6034,7 @@
         <w:pStyle w:val="ETCContent"/>
       </w:pPr>
       <w:r>
-        <w:t xml:space="preserve">• Ô tìm kiếm (search) — Gõ từ khóa, Enter hoặc debounce</w:t>
+        <w:t xml:space="preserve">• Email/Username (input) — Bắt buộc</w:t>
       </w:r>
     </w:p>
     <w:p>
@@ -6758,7 +6042,15 @@
         <w:pStyle w:val="ETCContent"/>
       </w:pPr>
       <w:r>
-        <w:t xml:space="preserve">• Bộ lọc trạng thái (tabs) — Tất cả / Đang học</w:t>
+        <w:t xml:space="preserve">• Password (password) — Bắt buộc</w:t>
+      </w:r>
+    </w:p>
+    <w:p>
+      <w:pPr>
+        <w:pStyle w:val="ETCContent"/>
+      </w:pPr>
+      <w:r>
+        <w:t xml:space="preserve">• Login button (button) — Enabled khi form hợp lệ</w:t>
       </w:r>
     </w:p>
     <w:p>
@@ -6769,7 +6061,208 @@
         <w:rPr>
           <w:b/>
         </w:rPr>
-        <w:t xml:space="preserve">Bước 1: Mở trang Khóa học từ menu học viên</w:t>
+        <w:t xml:space="preserve">Bước 1: Mở trang chủ và truy cập màn hình đăng nhập</w:t>
+      </w:r>
+    </w:p>
+    <w:p>
+      <w:pPr>
+        <w:pStyle w:val="ETCContent"/>
+      </w:pPr>
+      <w:r>
+        <w:t xml:space="preserve"/>
+      </w:r>
+      <w:r>
+        <w:drawing>
+          <wp:inline>
+            <wp:extent cx="5029200" cy="5023698"/>
+            <wp:docPr id="1003" name="Picture 74505"/>
+            <wp:cNvGraphicFramePr>
+              <a:graphicFrameLocks noChangeAspect="1"/>
+            </wp:cNvGraphicFramePr>
+            <a:graphic>
+              <a:graphicData uri="http://schemas.openxmlformats.org/drawingml/2006/picture">
+                <pic:pic>
+                  <pic:nvPicPr>
+                    <pic:cNvPr id="0" name="F-004-step-01-login.png"/>
+                    <pic:cNvPicPr/>
+                  </pic:nvPicPr>
+                  <pic:blipFill>
+                    <a:blip r:embed="rId18"/>
+                    <a:stretch>
+                      <a:fillRect/>
+                    </a:stretch>
+                  </pic:blipFill>
+                  <pic:spPr>
+                    <a:xfrm>
+                      <a:off x="0" y="0"/>
+                      <a:ext cx="5029200" cy="5023698"/>
+                    </a:xfrm>
+                    <a:prstGeom prst="rect"/>
+                  </pic:spPr>
+                </pic:pic>
+              </a:graphicData>
+            </a:graphic>
+          </wp:inline>
+        </w:drawing>
+      </w:r>
+      <w:r>
+        <w:t xml:space="preserve"/>
+      </w:r>
+    </w:p>
+    <w:p>
+      <w:pPr>
+        <w:pStyle w:val="ETCContent"/>
+      </w:pPr>
+      <w:r>
+        <w:t xml:space="preserve">→ Kết quả: Form đăng nhập hiển thị đầy đủ</w:t>
+      </w:r>
+    </w:p>
+    <w:p>
+      <w:pPr>
+        <w:pStyle w:val="ETCContent"/>
+      </w:pPr>
+      <w:r>
+        <w:rPr>
+          <w:b/>
+        </w:rPr>
+        <w:t xml:space="preserve">Bước 2: Nhập admin/admin và gửi form</w:t>
+      </w:r>
+    </w:p>
+    <w:p>
+      <w:pPr>
+        <w:pStyle w:val="ETCContent"/>
+      </w:pPr>
+      <w:r>
+        <w:t xml:space="preserve"/>
+      </w:r>
+      <w:r>
+        <w:drawing>
+          <wp:inline>
+            <wp:extent cx="5029200" cy="4682732"/>
+            <wp:docPr id="1004" name="Picture 74505"/>
+            <wp:cNvGraphicFramePr>
+              <a:graphicFrameLocks noChangeAspect="1"/>
+            </wp:cNvGraphicFramePr>
+            <a:graphic>
+              <a:graphicData uri="http://schemas.openxmlformats.org/drawingml/2006/picture">
+                <pic:pic>
+                  <pic:nvPicPr>
+                    <pic:cNvPr id="0" name="F-001-step-01-list.png"/>
+                    <pic:cNvPicPr/>
+                  </pic:nvPicPr>
+                  <pic:blipFill>
+                    <a:blip r:embed="rId19"/>
+                    <a:stretch>
+                      <a:fillRect/>
+                    </a:stretch>
+                  </pic:blipFill>
+                  <pic:spPr>
+                    <a:xfrm>
+                      <a:off x="0" y="0"/>
+                      <a:ext cx="5029200" cy="4682732"/>
+                    </a:xfrm>
+                    <a:prstGeom prst="rect"/>
+                  </pic:spPr>
+                </pic:pic>
+              </a:graphicData>
+            </a:graphic>
+          </wp:inline>
+        </w:drawing>
+      </w:r>
+      <w:r>
+        <w:t xml:space="preserve"/>
+      </w:r>
+    </w:p>
+    <w:p>
+      <w:pPr>
+        <w:pStyle w:val="ETCContent"/>
+      </w:pPr>
+      <w:r>
+        <w:t xml:space="preserve">→ Kết quả: Hệ thống trả JWT và điều hướng trang học tập</w:t>
+      </w:r>
+    </w:p>
+    <w:p>
+      <w:pPr>
+        <w:pStyle w:val="ETCContent"/>
+      </w:pPr>
+      <w:r>
+        <w:rPr>
+          <w:b/>
+        </w:rPr>
+        <w:t>Các trường hợp lỗi:</w:t>
+      </w:r>
+    </w:p>
+    <w:p>
+      <w:pPr>
+        <w:pStyle w:val="ETCContent"/>
+      </w:pPr>
+      <w:r>
+        <w:t xml:space="preserve">• Bước 2: Sai mật khẩu → Invalid email/username or password</w:t>
+      </w:r>
+    </w:p>
+    <w:p>
+      <w:pPr>
+        <w:pStyle w:val="AHeading4"/>
+      </w:pPr>
+      <w:r>
+        <w:t xml:space="preserve">Xem danh sách khóa học</w:t>
+      </w:r>
+    </w:p>
+    <w:p>
+      <w:pPr>
+        <w:pStyle w:val="ETCContent"/>
+      </w:pPr>
+      <w:r>
+        <w:t xml:space="preserve">Học viên truy cập danh sách khóa học và mở chi tiết khóa học.</w:t>
+      </w:r>
+    </w:p>
+    <w:p>
+      <w:pPr>
+        <w:pStyle w:val="ETCContent"/>
+      </w:pPr>
+      <w:r>
+        <w:rPr>
+          <w:i/>
+        </w:rPr>
+        <w:t xml:space="preserve">Điều kiện tiên quyết: Đăng nhập hợp lệ.</w:t>
+      </w:r>
+    </w:p>
+    <w:p>
+      <w:pPr>
+        <w:pStyle w:val="ETCContent"/>
+      </w:pPr>
+      <w:r>
+        <w:rPr>
+          <w:b/>
+        </w:rPr>
+        <w:t>Các thành phần trên màn hình:</w:t>
+      </w:r>
+    </w:p>
+    <w:p>
+      <w:pPr>
+        <w:pStyle w:val="ETCContent"/>
+      </w:pPr>
+      <w:r>
+        <w:t xml:space="preserve">• Learning tab (tab) — Cho phép chuyển module</w:t>
+      </w:r>
+    </w:p>
+    <w:p>
+      <w:pPr>
+        <w:pStyle w:val="ETCContent"/>
+      </w:pPr>
+      <w:r>
+        <w:t xml:space="preserve">• Course cards (list) — Load từ API /courses</w:t>
+      </w:r>
+    </w:p>
+    <w:p>
+      <w:pPr>
+        <w:pStyle w:val="ETCContent"/>
+      </w:pPr>
+      <w:r>
+        <w:rPr>
+          <w:b/>
+        </w:rPr>
+        <w:t xml:space="preserve">Bước 1: Mở tab Học tập</w:t>
       </w:r>
     </w:p>
     <w:p>
@@ -6783,7 +6276,7 @@
         <w:drawing>
           <wp:inline>
             <wp:extent cx="5029200" cy="3143250"/>
-            <wp:docPr id="1003" name="Picture 74505"/>
+            <wp:docPr id="1005" name="Picture 74505"/>
             <wp:cNvGraphicFramePr>
               <a:graphicFrameLocks noChangeAspect="1"/>
             </wp:cNvGraphicFramePr>
@@ -6795,7 +6288,7 @@
                     <pic:cNvPicPr/>
                   </pic:nvPicPr>
                   <pic:blipFill>
-                    <a:blip r:embed="rId18"/>
+                    <a:blip r:embed="rId20"/>
                     <a:stretch>
                       <a:fillRect/>
                     </a:stretch>
@@ -6819,29 +6312,10 @@
     </w:p>
     <w:p>
       <w:pPr>
-        <w:pStyle w:val="AHeading4"/>
-      </w:pPr>
-      <w:r>
-        <w:t xml:space="preserve">Xem chi tiết khóa học  chương trình</w:t>
-      </w:r>
-    </w:p>
-    <w:p>
-      <w:pPr>
         <w:pStyle w:val="ETCContent"/>
       </w:pPr>
       <w:r>
-        <w:t xml:space="preserve">Xem mô tả, rating, bài giảng trong sidebar, tab Q</w:t>
-      </w:r>
-    </w:p>
-    <w:p>
-      <w:pPr>
-        <w:pStyle w:val="ETCContent"/>
-      </w:pPr>
-      <w:r>
-        <w:rPr>
-          <w:i/>
-        </w:rPr>
-        <w:t xml:space="preserve">Điều kiện tiên quyết: Khóa học đang hiển thị trong catalog (published).</w:t>
+        <w:t xml:space="preserve">→ Kết quả: Danh sách khóa học hiển thị</w:t>
       </w:r>
     </w:p>
     <w:p>
@@ -6852,34 +6326,7 @@
         <w:rPr>
           <w:b/>
         </w:rPr>
-        <w:t>Các thành phần trên màn hình:</w:t>
-      </w:r>
-    </w:p>
-    <w:p>
-      <w:pPr>
-        <w:pStyle w:val="ETCContent"/>
-      </w:pPr>
-      <w:r>
-        <w:t xml:space="preserve">• Cây bài giảng (list) — Click bài để mở video</w:t>
-      </w:r>
-    </w:p>
-    <w:p>
-      <w:pPr>
-        <w:pStyle w:val="ETCContent"/>
-      </w:pPr>
-      <w:r>
-        <w:t xml:space="preserve">• Tab Hỏi đáp (tab) — Đăng câu hỏi khi đã ghi danh</w:t>
-      </w:r>
-    </w:p>
-    <w:p>
-      <w:pPr>
-        <w:pStyle w:val="ETCContent"/>
-      </w:pPr>
-      <w:r>
-        <w:rPr>
-          <w:b/>
-        </w:rPr>
-        <w:t xml:space="preserve">Bước 1: Chọn một khóa học từ danh sách</w:t>
+        <w:t xml:space="preserve">Bước 2: Chọn một khóa học để xem chi tiết</w:t>
       </w:r>
     </w:p>
     <w:p>
@@ -6893,7 +6340,7 @@
         <w:drawing>
           <wp:inline>
             <wp:extent cx="5029200" cy="3180522"/>
-            <wp:docPr id="1004" name="Picture 74505"/>
+            <wp:docPr id="1006" name="Picture 74505"/>
             <wp:cNvGraphicFramePr>
               <a:graphicFrameLocks noChangeAspect="1"/>
             </wp:cNvGraphicFramePr>
@@ -6905,7 +6352,7 @@
                     <pic:cNvPicPr/>
                   </pic:nvPicPr>
                   <pic:blipFill>
-                    <a:blip r:embed="rId19"/>
+                    <a:blip r:embed="rId21"/>
                     <a:stretch>
                       <a:fillRect/>
                     </a:stretch>
@@ -6929,10 +6376,10 @@
     </w:p>
     <w:p>
       <w:pPr>
-        <w:pStyle w:val="AHeading4"/>
-      </w:pPr>
-      <w:r>
-        <w:t xml:space="preserve">Phát video bài giảng</w:t>
+        <w:pStyle w:val="ETCContent"/>
+      </w:pPr>
+      <w:r>
+        <w:t xml:space="preserve">→ Kết quả: Trang chi tiết khóa học mở thành công</w:t>
       </w:r>
     </w:p>
     <w:p>
@@ -6940,7 +6387,34 @@
         <w:pStyle w:val="ETCContent"/>
       </w:pPr>
       <w:r>
-        <w:t xml:space="preserve">Trình phát video, thanh tiến độ, đánh dấu hoàn thành bài.</w:t>
+        <w:rPr>
+          <w:b/>
+        </w:rPr>
+        <w:t>Các trường hợp lỗi:</w:t>
+      </w:r>
+    </w:p>
+    <w:p>
+      <w:pPr>
+        <w:pStyle w:val="ETCContent"/>
+      </w:pPr>
+      <w:r>
+        <w:t xml:space="preserve">• Bước 1: API timeout → Không tải được danh sách khóa học</w:t>
+      </w:r>
+    </w:p>
+    <w:p>
+      <w:pPr>
+        <w:pStyle w:val="AHeading4"/>
+      </w:pPr>
+      <w:r>
+        <w:t xml:space="preserve">Truy cập Trung tâm khảo thí</w:t>
+      </w:r>
+    </w:p>
+    <w:p>
+      <w:pPr>
+        <w:pStyle w:val="ETCContent"/>
+      </w:pPr>
+      <w:r>
+        <w:t xml:space="preserve">Người học chuyển sang module khảo thí và mở danh sách kỳ thi.</w:t>
       </w:r>
     </w:p>
     <w:p>
@@ -6951,7 +6425,7 @@
         <w:rPr>
           <w:i/>
         </w:rPr>
-        <w:t xml:space="preserve">Điều kiện tiên quyết: Đã ghi danh; bài giảng loại video.</w:t>
+        <w:t xml:space="preserve">Điều kiện tiên quyết: Đã đăng nhập.</w:t>
       </w:r>
     </w:p>
     <w:p>
@@ -6970,7 +6444,7 @@
         <w:pStyle w:val="ETCContent"/>
       </w:pPr>
       <w:r>
-        <w:t xml:space="preserve">• Trình phát (video) — Play/Pause, seek, tốc độ</w:t>
+        <w:t xml:space="preserve">• Exams tab (tab) — Hiển thị khi user có quyền student</w:t>
       </w:r>
     </w:p>
     <w:p>
@@ -6981,7 +6455,374 @@
         <w:rPr>
           <w:b/>
         </w:rPr>
-        <w:t xml:space="preserve">Bước 1: Mở bài video trong khóa học</w:t>
+        <w:t xml:space="preserve">Bước 1: Mở menu Exams</w:t>
+      </w:r>
+    </w:p>
+    <w:p>
+      <w:pPr>
+        <w:pStyle w:val="ETCContent"/>
+      </w:pPr>
+      <w:r>
+        <w:t xml:space="preserve"/>
+      </w:r>
+      <w:r>
+        <w:drawing>
+          <wp:inline>
+            <wp:extent cx="5029200" cy="4682732"/>
+            <wp:docPr id="1007" name="Picture 74505"/>
+            <wp:cNvGraphicFramePr>
+              <a:graphicFrameLocks noChangeAspect="1"/>
+            </wp:cNvGraphicFramePr>
+            <a:graphic>
+              <a:graphicData uri="http://schemas.openxmlformats.org/drawingml/2006/picture">
+                <pic:pic>
+                  <pic:nvPicPr>
+                    <pic:cNvPr id="0" name="F-003-step-01-exam-menu.png"/>
+                    <pic:cNvPicPr/>
+                  </pic:nvPicPr>
+                  <pic:blipFill>
+                    <a:blip r:embed="rId22"/>
+                    <a:stretch>
+                      <a:fillRect/>
+                    </a:stretch>
+                  </pic:blipFill>
+                  <pic:spPr>
+                    <a:xfrm>
+                      <a:off x="0" y="0"/>
+                      <a:ext cx="5029200" cy="4682732"/>
+                    </a:xfrm>
+                    <a:prstGeom prst="rect"/>
+                  </pic:spPr>
+                </pic:pic>
+              </a:graphicData>
+            </a:graphic>
+          </wp:inline>
+        </w:drawing>
+      </w:r>
+      <w:r>
+        <w:t xml:space="preserve"/>
+      </w:r>
+    </w:p>
+    <w:p>
+      <w:pPr>
+        <w:pStyle w:val="ETCContent"/>
+      </w:pPr>
+      <w:r>
+        <w:t xml:space="preserve">→ Kết quả: Menu khảo thí hiển thị</w:t>
+      </w:r>
+    </w:p>
+    <w:p>
+      <w:pPr>
+        <w:pStyle w:val="ETCContent"/>
+      </w:pPr>
+      <w:r>
+        <w:rPr>
+          <w:b/>
+        </w:rPr>
+        <w:t xml:space="preserve">Bước 2: Vào màn hình trung tâm khảo thí</w:t>
+      </w:r>
+    </w:p>
+    <w:p>
+      <w:pPr>
+        <w:pStyle w:val="ETCContent"/>
+      </w:pPr>
+      <w:r>
+        <w:t xml:space="preserve"/>
+      </w:r>
+      <w:r>
+        <w:drawing>
+          <wp:inline>
+            <wp:extent cx="5029200" cy="6162696"/>
+            <wp:docPr id="1008" name="Picture 74505"/>
+            <wp:cNvGraphicFramePr>
+              <a:graphicFrameLocks noChangeAspect="1"/>
+            </wp:cNvGraphicFramePr>
+            <a:graphic>
+              <a:graphicData uri="http://schemas.openxmlformats.org/drawingml/2006/picture">
+                <pic:pic>
+                  <pic:nvPicPr>
+                    <pic:cNvPr id="0" name="F-003-step-02-exam-center.png"/>
+                    <pic:cNvPicPr/>
+                  </pic:nvPicPr>
+                  <pic:blipFill>
+                    <a:blip r:embed="rId23"/>
+                    <a:stretch>
+                      <a:fillRect/>
+                    </a:stretch>
+                  </pic:blipFill>
+                  <pic:spPr>
+                    <a:xfrm>
+                      <a:off x="0" y="0"/>
+                      <a:ext cx="5029200" cy="6162696"/>
+                    </a:xfrm>
+                    <a:prstGeom prst="rect"/>
+                  </pic:spPr>
+                </pic:pic>
+              </a:graphicData>
+            </a:graphic>
+          </wp:inline>
+        </w:drawing>
+      </w:r>
+      <w:r>
+        <w:t xml:space="preserve"/>
+      </w:r>
+    </w:p>
+    <w:p>
+      <w:pPr>
+        <w:pStyle w:val="ETCContent"/>
+      </w:pPr>
+      <w:r>
+        <w:t xml:space="preserve">→ Kết quả: Danh sách kỳ thi xuất hiện</w:t>
+      </w:r>
+    </w:p>
+    <w:p>
+      <w:pPr>
+        <w:pStyle w:val="AHeading4"/>
+      </w:pPr>
+      <w:r>
+        <w:t xml:space="preserve">eKYC trước khi vào thi</w:t>
+      </w:r>
+    </w:p>
+    <w:p>
+      <w:pPr>
+        <w:pStyle w:val="ETCContent"/>
+      </w:pPr>
+      <w:r>
+        <w:t xml:space="preserve">Thực hiện xác minh danh tính trước khi bắt đầu phiên thi.</w:t>
+      </w:r>
+    </w:p>
+    <w:p>
+      <w:pPr>
+        <w:pStyle w:val="ETCContent"/>
+      </w:pPr>
+      <w:r>
+        <w:rPr>
+          <w:i/>
+        </w:rPr>
+        <w:t xml:space="preserve">Điều kiện tiên quyết: Đang ở flow khảo thí.</w:t>
+      </w:r>
+    </w:p>
+    <w:p>
+      <w:pPr>
+        <w:pStyle w:val="ETCContent"/>
+      </w:pPr>
+      <w:r>
+        <w:rPr>
+          <w:b/>
+        </w:rPr>
+        <w:t>Các thành phần trên màn hình:</w:t>
+      </w:r>
+    </w:p>
+    <w:p>
+      <w:pPr>
+        <w:pStyle w:val="ETCContent"/>
+      </w:pPr>
+      <w:r>
+        <w:t xml:space="preserve">• eKYC panel (panel) — Yêu cầu camera</w:t>
+      </w:r>
+    </w:p>
+    <w:p>
+      <w:pPr>
+        <w:pStyle w:val="ETCContent"/>
+      </w:pPr>
+      <w:r>
+        <w:rPr>
+          <w:b/>
+        </w:rPr>
+        <w:t xml:space="preserve">Bước 1: Mở bước eKYC</w:t>
+      </w:r>
+    </w:p>
+    <w:p>
+      <w:pPr>
+        <w:pStyle w:val="ETCContent"/>
+      </w:pPr>
+      <w:r>
+        <w:t xml:space="preserve"/>
+      </w:r>
+      <w:r>
+        <w:drawing>
+          <wp:inline>
+            <wp:extent cx="5029200" cy="4682732"/>
+            <wp:docPr id="1009" name="Picture 74505"/>
+            <wp:cNvGraphicFramePr>
+              <a:graphicFrameLocks noChangeAspect="1"/>
+            </wp:cNvGraphicFramePr>
+            <a:graphic>
+              <a:graphicData uri="http://schemas.openxmlformats.org/drawingml/2006/picture">
+                <pic:pic>
+                  <pic:nvPicPr>
+                    <pic:cNvPr id="0" name="F-006-step-01-ekyc-initial.png"/>
+                    <pic:cNvPicPr/>
+                  </pic:nvPicPr>
+                  <pic:blipFill>
+                    <a:blip r:embed="rId24"/>
+                    <a:stretch>
+                      <a:fillRect/>
+                    </a:stretch>
+                  </pic:blipFill>
+                  <pic:spPr>
+                    <a:xfrm>
+                      <a:off x="0" y="0"/>
+                      <a:ext cx="5029200" cy="4682732"/>
+                    </a:xfrm>
+                    <a:prstGeom prst="rect"/>
+                  </pic:spPr>
+                </pic:pic>
+              </a:graphicData>
+            </a:graphic>
+          </wp:inline>
+        </w:drawing>
+      </w:r>
+      <w:r>
+        <w:t xml:space="preserve"/>
+      </w:r>
+    </w:p>
+    <w:p>
+      <w:pPr>
+        <w:pStyle w:val="ETCContent"/>
+      </w:pPr>
+      <w:r>
+        <w:t xml:space="preserve">→ Kết quả: Màn hình eKYC hiển thị trạng thái sẵn sàng</w:t>
+      </w:r>
+    </w:p>
+    <w:p>
+      <w:pPr>
+        <w:pStyle w:val="ETCContent"/>
+      </w:pPr>
+      <w:r>
+        <w:rPr>
+          <w:b/>
+        </w:rPr>
+        <w:t>Các trường hợp lỗi:</w:t>
+      </w:r>
+    </w:p>
+    <w:p>
+      <w:pPr>
+        <w:pStyle w:val="ETCContent"/>
+      </w:pPr>
+      <w:r>
+        <w:t xml:space="preserve">• Bước 1: Không cấp quyền camera → Không thể truy cập camera để xác minh danh tính</w:t>
+      </w:r>
+    </w:p>
+    <w:p>
+      <w:pPr>
+        <w:pStyle w:val="AHeading4"/>
+      </w:pPr>
+      <w:r>
+        <w:t xml:space="preserve">Vào phòng thi trực tuyến</w:t>
+      </w:r>
+    </w:p>
+    <w:p>
+      <w:pPr>
+        <w:pStyle w:val="ETCContent"/>
+      </w:pPr>
+      <w:r>
+        <w:t xml:space="preserve">Người học vào phòng thi và kết nối proctoring realtime.</w:t>
+      </w:r>
+    </w:p>
+    <w:p>
+      <w:pPr>
+        <w:pStyle w:val="ETCContent"/>
+      </w:pPr>
+      <w:r>
+        <w:rPr>
+          <w:i/>
+        </w:rPr>
+        <w:t xml:space="preserve">Điều kiện tiên quyết: Đã vượt qua eKYC.</w:t>
+      </w:r>
+    </w:p>
+    <w:p>
+      <w:pPr>
+        <w:pStyle w:val="ETCContent"/>
+      </w:pPr>
+      <w:r>
+        <w:rPr>
+          <w:b/>
+        </w:rPr>
+        <w:t>Các thành phần trên màn hình:</w:t>
+      </w:r>
+    </w:p>
+    <w:p>
+      <w:pPr>
+        <w:pStyle w:val="ETCContent"/>
+      </w:pPr>
+      <w:r>
+        <w:t xml:space="preserve">• Exam room container (layout) — Hiển thị camera + video player</w:t>
+      </w:r>
+    </w:p>
+    <w:p>
+      <w:pPr>
+        <w:pStyle w:val="ETCContent"/>
+      </w:pPr>
+      <w:r>
+        <w:rPr>
+          <w:b/>
+        </w:rPr>
+        <w:t xml:space="preserve">Bước 1: Mở phòng thi</w:t>
+      </w:r>
+    </w:p>
+    <w:p>
+      <w:pPr>
+        <w:pStyle w:val="ETCContent"/>
+      </w:pPr>
+      <w:r>
+        <w:t xml:space="preserve"/>
+      </w:r>
+      <w:r>
+        <w:drawing>
+          <wp:inline>
+            <wp:extent cx="5029200" cy="4942583"/>
+            <wp:docPr id="1010" name="Picture 74505"/>
+            <wp:cNvGraphicFramePr>
+              <a:graphicFrameLocks noChangeAspect="1"/>
+            </wp:cNvGraphicFramePr>
+            <a:graphic>
+              <a:graphicData uri="http://schemas.openxmlformats.org/drawingml/2006/picture">
+                <pic:pic>
+                  <pic:nvPicPr>
+                    <pic:cNvPr id="0" name="F-008-step-01-exam-room-initial.png"/>
+                    <pic:cNvPicPr/>
+                  </pic:nvPicPr>
+                  <pic:blipFill>
+                    <a:blip r:embed="rId25"/>
+                    <a:stretch>
+                      <a:fillRect/>
+                    </a:stretch>
+                  </pic:blipFill>
+                  <pic:spPr>
+                    <a:xfrm>
+                      <a:off x="0" y="0"/>
+                      <a:ext cx="5029200" cy="4942583"/>
+                    </a:xfrm>
+                    <a:prstGeom prst="rect"/>
+                  </pic:spPr>
+                </pic:pic>
+              </a:graphicData>
+            </a:graphic>
+          </wp:inline>
+        </w:drawing>
+      </w:r>
+      <w:r>
+        <w:t xml:space="preserve"/>
+      </w:r>
+    </w:p>
+    <w:p>
+      <w:pPr>
+        <w:pStyle w:val="ETCContent"/>
+      </w:pPr>
+      <w:r>
+        <w:t xml:space="preserve">→ Kết quả: Phòng thi khởi tạo thành công</w:t>
+      </w:r>
+    </w:p>
+    <w:p>
+      <w:pPr>
+        <w:pStyle w:val="ETCContent"/>
+      </w:pPr>
+      <w:r>
+        <w:rPr>
+          <w:b/>
+        </w:rPr>
+        <w:t xml:space="preserve">Bước 2: Kiểm tra khung video giám sát</w:t>
       </w:r>
     </w:p>
     <w:p>
@@ -6995,7 +6836,7 @@
         <w:drawing>
           <wp:inline>
             <wp:extent cx="5029200" cy="3267986"/>
-            <wp:docPr id="1005" name="Picture 74505"/>
+            <wp:docPr id="1011" name="Picture 74505"/>
             <wp:cNvGraphicFramePr>
               <a:graphicFrameLocks noChangeAspect="1"/>
             </wp:cNvGraphicFramePr>
@@ -7007,7 +6848,7 @@
                     <pic:cNvPicPr/>
                   </pic:nvPicPr>
                   <pic:blipFill>
-                    <a:blip r:embed="rId20"/>
+                    <a:blip r:embed="rId26"/>
                     <a:stretch>
                       <a:fillRect/>
                     </a:stretch>
@@ -7031,18 +6872,34 @@
     </w:p>
     <w:p>
       <w:pPr>
-        <w:pStyle w:val="AHeading4"/>
-      </w:pPr>
-      <w:r>
-        <w:t xml:space="preserve">Hỏi đáp trên khóa học (Q)</w:t>
+        <w:pStyle w:val="ETCContent"/>
+      </w:pPr>
+      <w:r>
+        <w:t xml:space="preserve">→ Kết quả: Video player hiển thị ổn định</w:t>
       </w:r>
     </w:p>
     <w:p>
       <w:pPr>
+        <w:pStyle w:val="AHeading3"/>
+      </w:pPr>
+      <w:r>
+        <w:t xml:space="preserve">Instructor Workspace</w:t>
+      </w:r>
+    </w:p>
+    <w:p>
+      <w:pPr>
+        <w:pStyle w:val="AHeading4"/>
+      </w:pPr>
+      <w:r>
+        <w:t xml:space="preserve">Tạo khóa học mới</w:t>
+      </w:r>
+    </w:p>
+    <w:p>
+      <w:pPr>
         <w:pStyle w:val="ETCContent"/>
       </w:pPr>
       <w:r>
-        <w:t xml:space="preserve">Học viên xem thread Q, đặt câu hỏi; giảng viên/trợ giảng trả lời qua API student/courses/:courseId/qa.</w:t>
+        <w:t xml:space="preserve">Giảng viên tạo khóa học ở trạng thái draft.</w:t>
       </w:r>
     </w:p>
     <w:p>
@@ -7053,7 +6910,7 @@
         <w:rPr>
           <w:i/>
         </w:rPr>
-        <w:t xml:space="preserve">Điều kiện tiên quyết: Đã ghi danh khóa học; JWT student.</w:t>
+        <w:t xml:space="preserve">Điều kiện tiên quyết: Đăng nhập instructor@local.test/dev-instructor.</w:t>
       </w:r>
     </w:p>
     <w:p>
@@ -7072,7 +6929,7 @@
         <w:pStyle w:val="ETCContent"/>
       </w:pPr>
       <w:r>
-        <w:t xml:space="preserve">• Tab Hỏi đáp (tab) — POST nội dung câu hỏi</w:t>
+        <w:t xml:space="preserve">• Instructor switch (button) — Chỉ hiện khi đã login</w:t>
       </w:r>
     </w:p>
     <w:p>
@@ -7080,7 +6937,7 @@
         <w:pStyle w:val="ETCContent"/>
       </w:pPr>
       <w:r>
-        <w:t xml:space="preserve">• Danh sách câu hỏi (list) — GET /student/courses/:id/qa</w:t>
+        <w:t xml:space="preserve">• Create course button (button) — Gọi POST /courses</w:t>
       </w:r>
     </w:p>
     <w:p>
@@ -7091,7 +6948,7 @@
         <w:rPr>
           <w:b/>
         </w:rPr>
-        <w:t xml:space="preserve">Bước 1: Mở tab Q trong chi tiết khóa đã ghi danh</w:t>
+        <w:t xml:space="preserve">Bước 1: Chuyển sang dashboard Instructor</w:t>
       </w:r>
     </w:p>
     <w:p>
@@ -7104,8 +6961,8 @@
       <w:r>
         <w:drawing>
           <wp:inline>
-            <wp:extent cx="5029200" cy="3180522"/>
-            <wp:docPr id="1006" name="Picture 74505"/>
+            <wp:extent cx="5029200" cy="3143250"/>
+            <wp:docPr id="1012" name="Picture 74505"/>
             <wp:cNvGraphicFramePr>
               <a:graphicFrameLocks noChangeAspect="1"/>
             </wp:cNvGraphicFramePr>
@@ -7113,223 +6970,11 @@
               <a:graphicData uri="http://schemas.openxmlformats.org/drawingml/2006/picture">
                 <pic:pic>
                   <pic:nvPicPr>
-                    <pic:cNvPr id="0" name="courses-step-02-detail.png"/>
+                    <pic:cNvPr id="0" name="instructor-step-01-dashboard.png"/>
                     <pic:cNvPicPr/>
                   </pic:nvPicPr>
                   <pic:blipFill>
-                    <a:blip r:embed="rId19"/>
-                    <a:stretch>
-                      <a:fillRect/>
-                    </a:stretch>
-                  </pic:blipFill>
-                  <pic:spPr>
-                    <a:xfrm>
-                      <a:off x="0" y="0"/>
-                      <a:ext cx="5029200" cy="3180522"/>
-                    </a:xfrm>
-                    <a:prstGeom prst="rect"/>
-                  </pic:spPr>
-                </pic:pic>
-              </a:graphicData>
-            </a:graphic>
-          </wp:inline>
-        </w:drawing>
-      </w:r>
-      <w:r>
-        <w:t xml:space="preserve"/>
-      </w:r>
-    </w:p>
-    <w:p>
-      <w:pPr>
-        <w:pStyle w:val="AHeading4"/>
-      </w:pPr>
-      <w:r>
-        <w:t xml:space="preserve">Đánh dấu hoàn thành bài giảng</w:t>
-      </w:r>
-    </w:p>
-    <w:p>
-      <w:pPr>
-        <w:pStyle w:val="ETCContent"/>
-      </w:pPr>
-      <w:r>
-        <w:t xml:space="preserve">PATCH /student/courses/:courseId/lectures/:lectureId/complete — cập nhật tiến độ học.</w:t>
-      </w:r>
-    </w:p>
-    <w:p>
-      <w:pPr>
-        <w:pStyle w:val="ETCContent"/>
-      </w:pPr>
-      <w:r>
-        <w:rPr>
-          <w:i/>
-        </w:rPr>
-        <w:t xml:space="preserve">Điều kiện tiên quyết: Đã ghi danh; lecture tồn tại.</w:t>
-      </w:r>
-    </w:p>
-    <w:p>
-      <w:pPr>
-        <w:pStyle w:val="ETCContent"/>
-      </w:pPr>
-      <w:r>
-        <w:rPr>
-          <w:b/>
-        </w:rPr>
-        <w:t>Các thành phần trên màn hình:</w:t>
-      </w:r>
-    </w:p>
-    <w:p>
-      <w:pPr>
-        <w:pStyle w:val="ETCContent"/>
-      </w:pPr>
-      <w:r>
-        <w:t xml:space="preserve">• Trạng thái bài (toggle) — Gọi API khi user đánh dấu xong</w:t>
-      </w:r>
-    </w:p>
-    <w:p>
-      <w:pPr>
-        <w:pStyle w:val="ETCContent"/>
-      </w:pPr>
-      <w:r>
-        <w:rPr>
-          <w:b/>
-        </w:rPr>
-        <w:t xml:space="preserve">Bước 1: Hoàn tất xem bài và kích hoạt đánh dấu hoàn thành (nếu UI có)</w:t>
-      </w:r>
-    </w:p>
-    <w:p>
-      <w:pPr>
-        <w:pStyle w:val="ETCContent"/>
-      </w:pPr>
-      <w:r>
-        <w:t xml:space="preserve"/>
-      </w:r>
-      <w:r>
-        <w:drawing>
-          <wp:inline>
-            <wp:extent cx="5029200" cy="3267986"/>
-            <wp:docPr id="1007" name="Picture 74505"/>
-            <wp:cNvGraphicFramePr>
-              <a:graphicFrameLocks noChangeAspect="1"/>
-            </wp:cNvGraphicFramePr>
-            <a:graphic>
-              <a:graphicData uri="http://schemas.openxmlformats.org/drawingml/2006/picture">
-                <pic:pic>
-                  <pic:nvPicPr>
-                    <pic:cNvPr id="0" name="video-step-01-player.png"/>
-                    <pic:cNvPicPr/>
-                  </pic:nvPicPr>
-                  <pic:blipFill>
-                    <a:blip r:embed="rId20"/>
-                    <a:stretch>
-                      <a:fillRect/>
-                    </a:stretch>
-                  </pic:blipFill>
-                  <pic:spPr>
-                    <a:xfrm>
-                      <a:off x="0" y="0"/>
-                      <a:ext cx="5029200" cy="3267986"/>
-                    </a:xfrm>
-                    <a:prstGeom prst="rect"/>
-                  </pic:spPr>
-                </pic:pic>
-              </a:graphicData>
-            </a:graphic>
-          </wp:inline>
-        </w:drawing>
-      </w:r>
-      <w:r>
-        <w:t xml:space="preserve"/>
-      </w:r>
-    </w:p>
-    <w:p>
-      <w:pPr>
-        <w:pStyle w:val="AHeading3"/>
-      </w:pPr>
-      <w:r>
-        <w:t xml:space="preserve">Thi  giám sát</w:t>
-      </w:r>
-    </w:p>
-    <w:p>
-      <w:pPr>
-        <w:pStyle w:val="AHeading4"/>
-      </w:pPr>
-      <w:r>
-        <w:t xml:space="preserve">Xem lịch thi sắp tới</w:t>
-      </w:r>
-    </w:p>
-    <w:p>
-      <w:pPr>
-        <w:pStyle w:val="ETCContent"/>
-      </w:pPr>
-      <w:r>
-        <w:t xml:space="preserve">Danh sách lịch thi, trạng thái, hoãn thi, đăng ký dự thi.</w:t>
-      </w:r>
-    </w:p>
-    <w:p>
-      <w:pPr>
-        <w:pStyle w:val="ETCContent"/>
-      </w:pPr>
-      <w:r>
-        <w:rPr>
-          <w:i/>
-        </w:rPr>
-        <w:t xml:space="preserve">Điều kiện tiên quyết: Tài khoản đã đăng nhập.</w:t>
-      </w:r>
-    </w:p>
-    <w:p>
-      <w:pPr>
-        <w:pStyle w:val="ETCContent"/>
-      </w:pPr>
-      <w:r>
-        <w:rPr>
-          <w:b/>
-        </w:rPr>
-        <w:t>Các thành phần trên màn hình:</w:t>
-      </w:r>
-    </w:p>
-    <w:p>
-      <w:pPr>
-        <w:pStyle w:val="ETCContent"/>
-      </w:pPr>
-      <w:r>
-        <w:t xml:space="preserve">• Danh sách lịch (list) — Sắp theo thời gian</w:t>
-      </w:r>
-    </w:p>
-    <w:p>
-      <w:pPr>
-        <w:pStyle w:val="ETCContent"/>
-      </w:pPr>
-      <w:r>
-        <w:rPr>
-          <w:b/>
-        </w:rPr>
-        <w:t xml:space="preserve">Bước 1: Mở mục Lịch thi / Kỳ thi</w:t>
-      </w:r>
-    </w:p>
-    <w:p>
-      <w:pPr>
-        <w:pStyle w:val="ETCContent"/>
-      </w:pPr>
-      <w:r>
-        <w:t xml:space="preserve"/>
-      </w:r>
-      <w:r>
-        <w:drawing>
-          <wp:inline>
-            <wp:extent cx="5029200" cy="3143250"/>
-            <wp:docPr id="1008" name="Picture 74505"/>
-            <wp:cNvGraphicFramePr>
-              <a:graphicFrameLocks noChangeAspect="1"/>
-            </wp:cNvGraphicFramePr>
-            <a:graphic>
-              <a:graphicData uri="http://schemas.openxmlformats.org/drawingml/2006/picture">
-                <pic:pic>
-                  <pic:nvPicPr>
-                    <pic:cNvPr id="0" name="exams-step-01-list.png"/>
-                    <pic:cNvPicPr/>
-                  </pic:nvPicPr>
-                  <pic:blipFill>
-                    <a:blip r:embed="rId21"/>
+                    <a:blip r:embed="rId27"/>
                     <a:stretch>
                       <a:fillRect/>
                     </a:stretch>
@@ -7353,29 +6998,10 @@
     </w:p>
     <w:p>
       <w:pPr>
-        <w:pStyle w:val="AHeading4"/>
-      </w:pPr>
-      <w:r>
-        <w:t xml:space="preserve">Quy trình eKYC trước khi vào thi</w:t>
-      </w:r>
-    </w:p>
-    <w:p>
-      <w:pPr>
         <w:pStyle w:val="ETCContent"/>
       </w:pPr>
       <w:r>
-        <w:t xml:space="preserve">Chụp CCCD, ảnh khuôn mặt, so khớp 1:1 theo hướng dẫn hệ thống.</w:t>
-      </w:r>
-    </w:p>
-    <w:p>
-      <w:pPr>
-        <w:pStyle w:val="ETCContent"/>
-      </w:pPr>
-      <w:r>
-        <w:rPr>
-          <w:i/>
-        </w:rPr>
-        <w:t xml:space="preserve">Điều kiện tiên quyết: Đã có lịch thi; trình duyệt cho phép camera.</w:t>
+        <w:t xml:space="preserve">→ Kết quả: Sidebar instructor hiển thị</w:t>
       </w:r>
     </w:p>
     <w:p>
@@ -7386,7 +7012,7 @@
         <w:rPr>
           <w:b/>
         </w:rPr>
-        <w:t>Các thành phần trên màn hình:</w:t>
+        <w:t xml:space="preserve">Bước 2: Mở trang danh sách khóa học giảng viên</w:t>
       </w:r>
     </w:p>
     <w:p>
@@ -7394,32 +7020,13 @@
         <w:pStyle w:val="ETCContent"/>
       </w:pPr>
       <w:r>
-        <w:t xml:space="preserve">• Hướng dẫn từng bước (wizard) — Theo thứ tự: CCCD mặt trước/sau, selfie</w:t>
-      </w:r>
-    </w:p>
-    <w:p>
-      <w:pPr>
-        <w:pStyle w:val="ETCContent"/>
-      </w:pPr>
-      <w:r>
-        <w:rPr>
-          <w:b/>
-        </w:rPr>
-        <w:t xml:space="preserve">Bước 1: Bắt đầu phiên eKYC từ màn hình thi</w:t>
-      </w:r>
-    </w:p>
-    <w:p>
-      <w:pPr>
-        <w:pStyle w:val="ETCContent"/>
-      </w:pPr>
-      <w:r>
         <w:t xml:space="preserve"/>
       </w:r>
       <w:r>
         <w:drawing>
           <wp:inline>
-            <wp:extent cx="5029200" cy="3143250"/>
-            <wp:docPr id="1009" name="Picture 74505"/>
+            <wp:extent cx="5029200" cy="5832282"/>
+            <wp:docPr id="1013" name="Picture 74505"/>
             <wp:cNvGraphicFramePr>
               <a:graphicFrameLocks noChangeAspect="1"/>
             </wp:cNvGraphicFramePr>
@@ -7427,11 +7034,75 @@
               <a:graphicData uri="http://schemas.openxmlformats.org/drawingml/2006/picture">
                 <pic:pic>
                   <pic:nvPicPr>
-                    <pic:cNvPr id="0" name="ekyc-step-01-initial.png"/>
+                    <pic:cNvPr id="0" name="instructor-courses-step-01-list.png"/>
                     <pic:cNvPicPr/>
                   </pic:nvPicPr>
                   <pic:blipFill>
-                    <a:blip r:embed="rId22"/>
+                    <a:blip r:embed="rId28"/>
+                    <a:stretch>
+                      <a:fillRect/>
+                    </a:stretch>
+                  </pic:blipFill>
+                  <pic:spPr>
+                    <a:xfrm>
+                      <a:off x="0" y="0"/>
+                      <a:ext cx="5029200" cy="5832282"/>
+                    </a:xfrm>
+                    <a:prstGeom prst="rect"/>
+                  </pic:spPr>
+                </pic:pic>
+              </a:graphicData>
+            </a:graphic>
+          </wp:inline>
+        </w:drawing>
+      </w:r>
+      <w:r>
+        <w:t xml:space="preserve"/>
+      </w:r>
+    </w:p>
+    <w:p>
+      <w:pPr>
+        <w:pStyle w:val="ETCContent"/>
+      </w:pPr>
+      <w:r>
+        <w:t xml:space="preserve">→ Kết quả: Bảng khóa học hiển thị</w:t>
+      </w:r>
+    </w:p>
+    <w:p>
+      <w:pPr>
+        <w:pStyle w:val="ETCContent"/>
+      </w:pPr>
+      <w:r>
+        <w:rPr>
+          <w:b/>
+        </w:rPr>
+        <w:t xml:space="preserve">Bước 3: Nhấn Tạo khóa học mới</w:t>
+      </w:r>
+    </w:p>
+    <w:p>
+      <w:pPr>
+        <w:pStyle w:val="ETCContent"/>
+      </w:pPr>
+      <w:r>
+        <w:t xml:space="preserve"/>
+      </w:r>
+      <w:r>
+        <w:drawing>
+          <wp:inline>
+            <wp:extent cx="5029200" cy="3143250"/>
+            <wp:docPr id="1014" name="Picture 74505"/>
+            <wp:cNvGraphicFramePr>
+              <a:graphicFrameLocks noChangeAspect="1"/>
+            </wp:cNvGraphicFramePr>
+            <a:graphic>
+              <a:graphicData uri="http://schemas.openxmlformats.org/drawingml/2006/picture">
+                <pic:pic>
+                  <pic:nvPicPr>
+                    <pic:cNvPr id="0" name="instructor-course-step-01-create.png"/>
+                    <pic:cNvPicPr/>
+                  </pic:nvPicPr>
+                  <pic:blipFill>
+                    <a:blip r:embed="rId29"/>
                     <a:stretch>
                       <a:fillRect/>
                     </a:stretch>
@@ -7455,10 +7126,10 @@
     </w:p>
     <w:p>
       <w:pPr>
-        <w:pStyle w:val="AHeading4"/>
-      </w:pPr>
-      <w:r>
-        <w:t xml:space="preserve">Vào phòng thi (giám sát)</w:t>
+        <w:pStyle w:val="ETCContent"/>
+      </w:pPr>
+      <w:r>
+        <w:t xml:space="preserve">→ Kết quả: Khóa học draft mới được tạo</w:t>
       </w:r>
     </w:p>
     <w:p>
@@ -7466,7 +7137,34 @@
         <w:pStyle w:val="ETCContent"/>
       </w:pPr>
       <w:r>
-        <w:t xml:space="preserve">Giao diện phòng thi: câu hỏi, thời gian, cảnh báo vi phạm từ proctoring.</w:t>
+        <w:rPr>
+          <w:b/>
+        </w:rPr>
+        <w:t>Các trường hợp lỗi:</w:t>
+      </w:r>
+    </w:p>
+    <w:p>
+      <w:pPr>
+        <w:pStyle w:val="ETCContent"/>
+      </w:pPr>
+      <w:r>
+        <w:t xml:space="preserve">• Bước 3: Payload không hợp lệ → Không tạo được khóa học</w:t>
+      </w:r>
+    </w:p>
+    <w:p>
+      <w:pPr>
+        <w:pStyle w:val="AHeading4"/>
+      </w:pPr>
+      <w:r>
+        <w:t xml:space="preserve">Publish/Unpublish khóa học</w:t>
+      </w:r>
+    </w:p>
+    <w:p>
+      <w:pPr>
+        <w:pStyle w:val="ETCContent"/>
+      </w:pPr>
+      <w:r>
+        <w:t xml:space="preserve">Giảng viên thay đổi trạng thái phát hành khóa học.</w:t>
       </w:r>
     </w:p>
     <w:p>
@@ -7477,7 +7175,7 @@
         <w:rPr>
           <w:i/>
         </w:rPr>
-        <w:t xml:space="preserve">Điều kiện tiên quyết: eKYC thành công; ca thi mở.</w:t>
+        <w:t xml:space="preserve">Điều kiện tiên quyết: Khóa học tồn tại trong danh sách.</w:t>
       </w:r>
     </w:p>
     <w:p>
@@ -7496,7 +7194,7 @@
         <w:pStyle w:val="ETCContent"/>
       </w:pPr>
       <w:r>
-        <w:t xml:space="preserve">• Khu vực đề thi (form) — Chọn đáp án, nộp bài</w:t>
+        <w:t xml:space="preserve">• Publish/Unpublish button (button) — Hiển thị theo trạng thái khóa học</w:t>
       </w:r>
     </w:p>
     <w:p>
@@ -7507,7 +7205,7 @@
         <w:rPr>
           <w:b/>
         </w:rPr>
-        <w:t xml:space="preserve">Bước 1: Vào phòng thi sau khi xác minh</w:t>
+        <w:t xml:space="preserve">Bước 1: Mở danh sách khóa học</w:t>
       </w:r>
     </w:p>
     <w:p>
@@ -7520,8 +7218,8 @@
       <w:r>
         <w:drawing>
           <wp:inline>
-            <wp:extent cx="5029200" cy="3143250"/>
-            <wp:docPr id="1010" name="Picture 74505"/>
+            <wp:extent cx="5029200" cy="4682732"/>
+            <wp:docPr id="1015" name="Picture 74505"/>
             <wp:cNvGraphicFramePr>
               <a:graphicFrameLocks noChangeAspect="1"/>
             </wp:cNvGraphicFramePr>
@@ -7529,11 +7227,11 @@
               <a:graphicData uri="http://schemas.openxmlformats.org/drawingml/2006/picture">
                 <pic:pic>
                   <pic:nvPicPr>
-                    <pic:cNvPr id="0" name="exam-room-step-01-initial.png"/>
+                    <pic:cNvPr id="0" name="F-005-step-01-exams-list.png"/>
                     <pic:cNvPicPr/>
                   </pic:nvPicPr>
                   <pic:blipFill>
-                    <a:blip r:embed="rId23"/>
+                    <a:blip r:embed="rId30"/>
                     <a:stretch>
                       <a:fillRect/>
                     </a:stretch>
@@ -7541,7 +7239,7 @@
                   <pic:spPr>
                     <a:xfrm>
                       <a:off x="0" y="0"/>
-                      <a:ext cx="5029200" cy="3143250"/>
+                      <a:ext cx="5029200" cy="4682732"/>
                     </a:xfrm>
                     <a:prstGeom prst="rect"/>
                   </pic:spPr>
@@ -7557,29 +7255,10 @@
     </w:p>
     <w:p>
       <w:pPr>
-        <w:pStyle w:val="AHeading4"/>
-      </w:pPr>
-      <w:r>
-        <w:t xml:space="preserve">Đăng ký / hủy ứng viên dự thi</w:t>
-      </w:r>
-    </w:p>
-    <w:p>
-      <w:pPr>
         <w:pStyle w:val="ETCContent"/>
       </w:pPr>
       <w:r>
-        <w:t xml:space="preserve">POST /exam-schedules/:id/candidates đăng ký; DELETE /exam-candidates/:id hủy khi được phép.</w:t>
-      </w:r>
-    </w:p>
-    <w:p>
-      <w:pPr>
-        <w:pStyle w:val="ETCContent"/>
-      </w:pPr>
-      <w:r>
-        <w:rPr>
-          <w:i/>
-        </w:rPr>
-        <w:t xml:space="preserve">Điều kiện tiên quyết: Lịch thi mở đăng ký; JWT.</w:t>
+        <w:t xml:space="preserve">→ Kết quả: Danh sách khóa học xuất hiện</w:t>
       </w:r>
     </w:p>
     <w:p>
@@ -7590,552 +7269,7 @@
         <w:rPr>
           <w:b/>
         </w:rPr>
-        <w:t>Các thành phần trên màn hình:</w:t>
-      </w:r>
-    </w:p>
-    <w:p>
-      <w:pPr>
-        <w:pStyle w:val="ETCContent"/>
-      </w:pPr>
-      <w:r>
-        <w:t xml:space="preserve">• Nút đăng ký ca thi (button) — Gọi API candidates</w:t>
-      </w:r>
-    </w:p>
-    <w:p>
-      <w:pPr>
-        <w:pStyle w:val="ETCContent"/>
-      </w:pPr>
-      <w:r>
-        <w:rPr>
-          <w:b/>
-        </w:rPr>
-        <w:t xml:space="preserve">Bước 1: Từ lịch thi, chọn đăng ký hoặc hủy (theo UI)</w:t>
-      </w:r>
-    </w:p>
-    <w:p>
-      <w:pPr>
-        <w:pStyle w:val="ETCContent"/>
-      </w:pPr>
-      <w:r>
-        <w:t xml:space="preserve"/>
-      </w:r>
-      <w:r>
-        <w:drawing>
-          <wp:inline>
-            <wp:extent cx="5029200" cy="3143250"/>
-            <wp:docPr id="1011" name="Picture 74505"/>
-            <wp:cNvGraphicFramePr>
-              <a:graphicFrameLocks noChangeAspect="1"/>
-            </wp:cNvGraphicFramePr>
-            <a:graphic>
-              <a:graphicData uri="http://schemas.openxmlformats.org/drawingml/2006/picture">
-                <pic:pic>
-                  <pic:nvPicPr>
-                    <pic:cNvPr id="0" name="exams-step-01-list.png"/>
-                    <pic:cNvPicPr/>
-                  </pic:nvPicPr>
-                  <pic:blipFill>
-                    <a:blip r:embed="rId21"/>
-                    <a:stretch>
-                      <a:fillRect/>
-                    </a:stretch>
-                  </pic:blipFill>
-                  <pic:spPr>
-                    <a:xfrm>
-                      <a:off x="0" y="0"/>
-                      <a:ext cx="5029200" cy="3143250"/>
-                    </a:xfrm>
-                    <a:prstGeom prst="rect"/>
-                  </pic:spPr>
-                </pic:pic>
-              </a:graphicData>
-            </a:graphic>
-          </wp:inline>
-        </w:drawing>
-      </w:r>
-      <w:r>
-        <w:t xml:space="preserve"/>
-      </w:r>
-    </w:p>
-    <w:p>
-      <w:pPr>
-        <w:pStyle w:val="AHeading4"/>
-      </w:pPr>
-      <w:r>
-        <w:t xml:space="preserve">Yêu cầu hoãn thi</w:t>
-      </w:r>
-    </w:p>
-    <w:p>
-      <w:pPr>
-        <w:pStyle w:val="ETCContent"/>
-      </w:pPr>
-      <w:r>
-        <w:t xml:space="preserve">POST /exam-candidates/:id/postponement — tạo ticket hoãn theo quy định nghiệp vụ.</w:t>
-      </w:r>
-    </w:p>
-    <w:p>
-      <w:pPr>
-        <w:pStyle w:val="ETCContent"/>
-      </w:pPr>
-      <w:r>
-        <w:rPr>
-          <w:i/>
-        </w:rPr>
-        <w:t xml:space="preserve">Điều kiện tiên quyết: Đã là ứng viên của ca thi.</w:t>
-      </w:r>
-    </w:p>
-    <w:p>
-      <w:pPr>
-        <w:pStyle w:val="ETCContent"/>
-      </w:pPr>
-      <w:r>
-        <w:rPr>
-          <w:b/>
-        </w:rPr>
-        <w:t>Các thành phần trên màn hình:</w:t>
-      </w:r>
-    </w:p>
-    <w:p>
-      <w:pPr>
-        <w:pStyle w:val="ETCContent"/>
-      </w:pPr>
-      <w:r>
-        <w:t xml:space="preserve">• Hoãn thi (button) — Hiển thị lý do / trạng thái ticket</w:t>
-      </w:r>
-    </w:p>
-    <w:p>
-      <w:pPr>
-        <w:pStyle w:val="ETCContent"/>
-      </w:pPr>
-      <w:r>
-        <w:rPr>
-          <w:b/>
-        </w:rPr>
-        <w:t xml:space="preserve">Bước 1: Mở chi tiết ca thi đã đăng ký và gửi yêu cầu hoãn</w:t>
-      </w:r>
-    </w:p>
-    <w:p>
-      <w:pPr>
-        <w:pStyle w:val="ETCContent"/>
-      </w:pPr>
-      <w:r>
-        <w:t xml:space="preserve"/>
-      </w:r>
-      <w:r>
-        <w:drawing>
-          <wp:inline>
-            <wp:extent cx="5029200" cy="3143250"/>
-            <wp:docPr id="1012" name="Picture 74505"/>
-            <wp:cNvGraphicFramePr>
-              <a:graphicFrameLocks noChangeAspect="1"/>
-            </wp:cNvGraphicFramePr>
-            <a:graphic>
-              <a:graphicData uri="http://schemas.openxmlformats.org/drawingml/2006/picture">
-                <pic:pic>
-                  <pic:nvPicPr>
-                    <pic:cNvPr id="0" name="exams-step-01-list.png"/>
-                    <pic:cNvPicPr/>
-                  </pic:nvPicPr>
-                  <pic:blipFill>
-                    <a:blip r:embed="rId21"/>
-                    <a:stretch>
-                      <a:fillRect/>
-                    </a:stretch>
-                  </pic:blipFill>
-                  <pic:spPr>
-                    <a:xfrm>
-                      <a:off x="0" y="0"/>
-                      <a:ext cx="5029200" cy="3143250"/>
-                    </a:xfrm>
-                    <a:prstGeom prst="rect"/>
-                  </pic:spPr>
-                </pic:pic>
-              </a:graphicData>
-            </a:graphic>
-          </wp:inline>
-        </w:drawing>
-      </w:r>
-      <w:r>
-        <w:t xml:space="preserve"/>
-      </w:r>
-    </w:p>
-    <w:p>
-      <w:pPr>
-        <w:pStyle w:val="AHeading4"/>
-      </w:pPr>
-      <w:r>
-        <w:t xml:space="preserve">Làm bài: lưu đáp án  nộp bài</w:t>
-      </w:r>
-    </w:p>
-    <w:p>
-      <w:pPr>
-        <w:pStyle w:val="ETCContent"/>
-      </w:pPr>
-      <w:r>
-        <w:t xml:space="preserve">PUT /exam-sessions/:id/answers/:questionId lưu từng câu; POST /exam-sessions/:id/submit nộp bài.</w:t>
-      </w:r>
-    </w:p>
-    <w:p>
-      <w:pPr>
-        <w:pStyle w:val="ETCContent"/>
-      </w:pPr>
-      <w:r>
-        <w:rPr>
-          <w:i/>
-        </w:rPr>
-        <w:t xml:space="preserve">Điều kiện tiên quyết: Phiên thi in_progress; JWT.</w:t>
-      </w:r>
-    </w:p>
-    <w:p>
-      <w:pPr>
-        <w:pStyle w:val="ETCContent"/>
-      </w:pPr>
-      <w:r>
-        <w:rPr>
-          <w:b/>
-        </w:rPr>
-        <w:t>Các thành phần trên màn hình:</w:t>
-      </w:r>
-    </w:p>
-    <w:p>
-      <w:pPr>
-        <w:pStyle w:val="ETCContent"/>
-      </w:pPr>
-      <w:r>
-        <w:t xml:space="preserve">• Điều hướng câu (pager) — Auto-save theo debounce</w:t>
-      </w:r>
-    </w:p>
-    <w:p>
-      <w:pPr>
-        <w:pStyle w:val="ETCContent"/>
-      </w:pPr>
-      <w:r>
-        <w:t xml:space="preserve">• Nộp bài (button) — Xác nhận một lần</w:t>
-      </w:r>
-    </w:p>
-    <w:p>
-      <w:pPr>
-        <w:pStyle w:val="ETCContent"/>
-      </w:pPr>
-      <w:r>
-        <w:rPr>
-          <w:b/>
-        </w:rPr>
-        <w:t xml:space="preserve">Bước 1: Trong phòng thi, chọn đáp án và nộp bài</w:t>
-      </w:r>
-    </w:p>
-    <w:p>
-      <w:pPr>
-        <w:pStyle w:val="ETCContent"/>
-      </w:pPr>
-      <w:r>
-        <w:t xml:space="preserve"/>
-      </w:r>
-      <w:r>
-        <w:drawing>
-          <wp:inline>
-            <wp:extent cx="5029200" cy="3143250"/>
-            <wp:docPr id="1013" name="Picture 74505"/>
-            <wp:cNvGraphicFramePr>
-              <a:graphicFrameLocks noChangeAspect="1"/>
-            </wp:cNvGraphicFramePr>
-            <a:graphic>
-              <a:graphicData uri="http://schemas.openxmlformats.org/drawingml/2006/picture">
-                <pic:pic>
-                  <pic:nvPicPr>
-                    <pic:cNvPr id="0" name="exam-room-step-01-initial.png"/>
-                    <pic:cNvPicPr/>
-                  </pic:nvPicPr>
-                  <pic:blipFill>
-                    <a:blip r:embed="rId23"/>
-                    <a:stretch>
-                      <a:fillRect/>
-                    </a:stretch>
-                  </pic:blipFill>
-                  <pic:spPr>
-                    <a:xfrm>
-                      <a:off x="0" y="0"/>
-                      <a:ext cx="5029200" cy="3143250"/>
-                    </a:xfrm>
-                    <a:prstGeom prst="rect"/>
-                  </pic:spPr>
-                </pic:pic>
-              </a:graphicData>
-            </a:graphic>
-          </wp:inline>
-        </w:drawing>
-      </w:r>
-      <w:r>
-        <w:t xml:space="preserve"/>
-      </w:r>
-    </w:p>
-    <w:p>
-      <w:pPr>
-        <w:pStyle w:val="AHeading4"/>
-      </w:pPr>
-      <w:r>
-        <w:t xml:space="preserve">eKYC: tải ảnh CCCD  selfie, so khớp khuôn mặt</w:t>
-      </w:r>
-    </w:p>
-    <w:p>
-      <w:pPr>
-        <w:pStyle w:val="ETCContent"/>
-      </w:pPr>
-      <w:r>
-        <w:t xml:space="preserve">PATCH cccd-front/back, face-photo; POST face-match; GET /ekyc-sessions/:id theo code-facts.</w:t>
-      </w:r>
-    </w:p>
-    <w:p>
-      <w:pPr>
-        <w:pStyle w:val="ETCContent"/>
-      </w:pPr>
-      <w:r>
-        <w:rPr>
-          <w:i/>
-        </w:rPr>
-        <w:t xml:space="preserve">Điều kiện tiên quyết: Đã tạo ekyc-session từ lịch thi.</w:t>
-      </w:r>
-    </w:p>
-    <w:p>
-      <w:pPr>
-        <w:pStyle w:val="ETCContent"/>
-      </w:pPr>
-      <w:r>
-        <w:rPr>
-          <w:b/>
-        </w:rPr>
-        <w:t>Các thành phần trên màn hình:</w:t>
-      </w:r>
-    </w:p>
-    <w:p>
-      <w:pPr>
-        <w:pStyle w:val="ETCContent"/>
-      </w:pPr>
-      <w:r>
-        <w:t xml:space="preserve">• Upload ảnh (file) — Presigned S3 hoặc multipart theo triển khai</w:t>
-      </w:r>
-    </w:p>
-    <w:p>
-      <w:pPr>
-        <w:pStyle w:val="ETCContent"/>
-      </w:pPr>
-      <w:r>
-        <w:rPr>
-          <w:b/>
-        </w:rPr>
-        <w:t xml:space="preserve">Bước 1: Tải lên ảnh theo từng bước wizard eKYC</w:t>
-      </w:r>
-    </w:p>
-    <w:p>
-      <w:pPr>
-        <w:pStyle w:val="ETCContent"/>
-      </w:pPr>
-      <w:r>
-        <w:t xml:space="preserve"/>
-      </w:r>
-      <w:r>
-        <w:drawing>
-          <wp:inline>
-            <wp:extent cx="5029200" cy="3143250"/>
-            <wp:docPr id="1014" name="Picture 74505"/>
-            <wp:cNvGraphicFramePr>
-              <a:graphicFrameLocks noChangeAspect="1"/>
-            </wp:cNvGraphicFramePr>
-            <a:graphic>
-              <a:graphicData uri="http://schemas.openxmlformats.org/drawingml/2006/picture">
-                <pic:pic>
-                  <pic:nvPicPr>
-                    <pic:cNvPr id="0" name="ekyc-step-01-initial.png"/>
-                    <pic:cNvPicPr/>
-                  </pic:nvPicPr>
-                  <pic:blipFill>
-                    <a:blip r:embed="rId22"/>
-                    <a:stretch>
-                      <a:fillRect/>
-                    </a:stretch>
-                  </pic:blipFill>
-                  <pic:spPr>
-                    <a:xfrm>
-                      <a:off x="0" y="0"/>
-                      <a:ext cx="5029200" cy="3143250"/>
-                    </a:xfrm>
-                    <a:prstGeom prst="rect"/>
-                  </pic:spPr>
-                </pic:pic>
-              </a:graphicData>
-            </a:graphic>
-          </wp:inline>
-        </w:drawing>
-      </w:r>
-      <w:r>
-        <w:t xml:space="preserve"/>
-      </w:r>
-    </w:p>
-    <w:p>
-      <w:pPr>
-        <w:pStyle w:val="AHeading3"/>
-      </w:pPr>
-      <w:r>
-        <w:t xml:space="preserve">Giảng viên  quản lý nội dung</w:t>
-      </w:r>
-    </w:p>
-    <w:p>
-      <w:pPr>
-        <w:pStyle w:val="AHeading4"/>
-      </w:pPr>
-      <w:r>
-        <w:t xml:space="preserve">Bảng điều khiển giảng viên</w:t>
-      </w:r>
-    </w:p>
-    <w:p>
-      <w:pPr>
-        <w:pStyle w:val="ETCContent"/>
-      </w:pPr>
-      <w:r>
-        <w:t xml:space="preserve">Tổng quan khóa học, hoạt động gần đây, điều hướng tạo nội dung.</w:t>
-      </w:r>
-    </w:p>
-    <w:p>
-      <w:pPr>
-        <w:pStyle w:val="ETCContent"/>
-      </w:pPr>
-      <w:r>
-        <w:rPr>
-          <w:i/>
-        </w:rPr>
-        <w:t xml:space="preserve">Điều kiện tiên quyết: Tài khoản có role giảng viên.</w:t>
-      </w:r>
-    </w:p>
-    <w:p>
-      <w:pPr>
-        <w:pStyle w:val="ETCContent"/>
-      </w:pPr>
-      <w:r>
-        <w:rPr>
-          <w:b/>
-        </w:rPr>
-        <w:t>Các thành phần trên màn hình:</w:t>
-      </w:r>
-    </w:p>
-    <w:p>
-      <w:pPr>
-        <w:pStyle w:val="ETCContent"/>
-      </w:pPr>
-      <w:r>
-        <w:t xml:space="preserve">• Thẻ tóm tắt (cards) — KPI/shortcut</w:t>
-      </w:r>
-    </w:p>
-    <w:p>
-      <w:pPr>
-        <w:pStyle w:val="ETCContent"/>
-      </w:pPr>
-      <w:r>
-        <w:rPr>
-          <w:b/>
-        </w:rPr>
-        <w:t xml:space="preserve">Bước 1: Đăng nhập, chuyển chế độ giảng viên</w:t>
-      </w:r>
-    </w:p>
-    <w:p>
-      <w:pPr>
-        <w:pStyle w:val="ETCContent"/>
-      </w:pPr>
-      <w:r>
-        <w:t xml:space="preserve"/>
-      </w:r>
-      <w:r>
-        <w:drawing>
-          <wp:inline>
-            <wp:extent cx="5029200" cy="3143250"/>
-            <wp:docPr id="1015" name="Picture 74505"/>
-            <wp:cNvGraphicFramePr>
-              <a:graphicFrameLocks noChangeAspect="1"/>
-            </wp:cNvGraphicFramePr>
-            <a:graphic>
-              <a:graphicData uri="http://schemas.openxmlformats.org/drawingml/2006/picture">
-                <pic:pic>
-                  <pic:nvPicPr>
-                    <pic:cNvPr id="0" name="instructor-step-01-dashboard.png"/>
-                    <pic:cNvPicPr/>
-                  </pic:nvPicPr>
-                  <pic:blipFill>
-                    <a:blip r:embed="rId24"/>
-                    <a:stretch>
-                      <a:fillRect/>
-                    </a:stretch>
-                  </pic:blipFill>
-                  <pic:spPr>
-                    <a:xfrm>
-                      <a:off x="0" y="0"/>
-                      <a:ext cx="5029200" cy="3143250"/>
-                    </a:xfrm>
-                    <a:prstGeom prst="rect"/>
-                  </pic:spPr>
-                </pic:pic>
-              </a:graphicData>
-            </a:graphic>
-          </wp:inline>
-        </w:drawing>
-      </w:r>
-      <w:r>
-        <w:t xml:space="preserve"/>
-      </w:r>
-    </w:p>
-    <w:p>
-      <w:pPr>
-        <w:pStyle w:val="AHeading4"/>
-      </w:pPr>
-      <w:r>
-        <w:t xml:space="preserve">Danh sách khóa học của tôi</w:t>
-      </w:r>
-    </w:p>
-    <w:p>
-      <w:pPr>
-        <w:pStyle w:val="ETCContent"/>
-      </w:pPr>
-      <w:r>
-        <w:t xml:space="preserve">CRUD bản thảo, xuất bản, sửa cấu trúc sections/lectures.</w:t>
-      </w:r>
-    </w:p>
-    <w:p>
-      <w:pPr>
-        <w:pStyle w:val="ETCContent"/>
-      </w:pPr>
-      <w:r>
-        <w:rPr>
-          <w:i/>
-        </w:rPr>
-        <w:t xml:space="preserve">Điều kiện tiên quyết: JWT hợp lệ, role instructor.</w:t>
-      </w:r>
-    </w:p>
-    <w:p>
-      <w:pPr>
-        <w:pStyle w:val="ETCContent"/>
-      </w:pPr>
-      <w:r>
-        <w:rPr>
-          <w:b/>
-        </w:rPr>
-        <w:t>Các thành phần trên màn hình:</w:t>
-      </w:r>
-    </w:p>
-    <w:p>
-      <w:pPr>
-        <w:pStyle w:val="ETCContent"/>
-      </w:pPr>
-      <w:r>
-        <w:t xml:space="preserve">• Nút tạo khóa mới (button) — Tạo course draft</w:t>
-      </w:r>
-    </w:p>
-    <w:p>
-      <w:pPr>
-        <w:pStyle w:val="ETCContent"/>
-      </w:pPr>
-      <w:r>
-        <w:rPr>
-          <w:b/>
-        </w:rPr>
-        <w:t xml:space="preserve">Bước 1: Mở mục quản lý khóa học</w:t>
+        <w:t xml:space="preserve">Bước 2: Thao tác Publish hoặc Unpublish</w:t>
       </w:r>
     </w:p>
     <w:p>
@@ -8161,7 +7295,7 @@
                     <pic:cNvPicPr/>
                   </pic:nvPicPr>
                   <pic:blipFill>
-                    <a:blip r:embed="rId25"/>
+                    <a:blip r:embed="rId28"/>
                     <a:stretch>
                       <a:fillRect/>
                     </a:stretch>
@@ -8185,10 +7319,10 @@
     </w:p>
     <w:p>
       <w:pPr>
-        <w:pStyle w:val="AHeading4"/>
-      </w:pPr>
-      <w:r>
-        <w:t xml:space="preserve">Tạo / chỉnh sửa khóa học</w:t>
+        <w:pStyle w:val="ETCContent"/>
+      </w:pPr>
+      <w:r>
+        <w:t xml:space="preserve">→ Kết quả: Trạng thái khóa học được cập nhật tức thì</w:t>
       </w:r>
     </w:p>
     <w:p>
@@ -8196,7 +7330,42 @@
         <w:pStyle w:val="ETCContent"/>
       </w:pPr>
       <w:r>
-        <w:t xml:space="preserve">Form tiêu đề, mô tả, giá; liên kết với bài thi, sections.</w:t>
+        <w:rPr>
+          <w:b/>
+        </w:rPr>
+        <w:t>Các trường hợp lỗi:</w:t>
+      </w:r>
+    </w:p>
+    <w:p>
+      <w:pPr>
+        <w:pStyle w:val="ETCContent"/>
+      </w:pPr>
+      <w:r>
+        <w:t xml:space="preserve">• Bước 2: Không có quyền → Không thể cập nhật trạng thái khóa học</w:t>
+      </w:r>
+    </w:p>
+    <w:p>
+      <w:pPr>
+        <w:pStyle w:val="AHeading3"/>
+      </w:pPr>
+      <w:r>
+        <w:t xml:space="preserve">Backend API</w:t>
+      </w:r>
+    </w:p>
+    <w:p>
+      <w:pPr>
+        <w:pStyle w:val="AHeading4"/>
+      </w:pPr>
+      <w:r>
+        <w:t xml:space="preserve">Xem chi tiết kỳ thi qua API</w:t>
+      </w:r>
+    </w:p>
+    <w:p>
+      <w:pPr>
+        <w:pStyle w:val="ETCContent"/>
+      </w:pPr>
+      <w:r>
+        <w:t xml:space="preserve">Lấy dữ liệu chi tiết kỳ thi và trạng thái phiên thi phục vụ màn hình exam detail.</w:t>
       </w:r>
     </w:p>
     <w:p>
@@ -8207,7 +7376,7 @@
         <w:rPr>
           <w:i/>
         </w:rPr>
-        <w:t xml:space="preserve">Điều kiện tiên quyết: Có quyền tạo khóa (instructor).</w:t>
+        <w:t xml:space="preserve">Điều kiện tiên quyết: Token JWT hợp lệ.</w:t>
       </w:r>
     </w:p>
     <w:p>
@@ -8218,7 +7387,7 @@
         <w:rPr>
           <w:b/>
         </w:rPr>
-        <w:t>Các thành phần trên màn hình:</w:t>
+        <w:t xml:space="preserve">Bước 1: Gọi endpoint chi tiết kỳ thi</w:t>
       </w:r>
     </w:p>
     <w:p>
@@ -8226,31 +7395,12 @@
         <w:pStyle w:val="ETCContent"/>
       </w:pPr>
       <w:r>
-        <w:t xml:space="preserve">• Tiêu đề khóa (input) — Bắt buộc</w:t>
-      </w:r>
-    </w:p>
-    <w:p>
-      <w:pPr>
-        <w:pStyle w:val="ETCContent"/>
-      </w:pPr>
-      <w:r>
-        <w:rPr>
-          <w:b/>
-        </w:rPr>
-        <w:t xml:space="preserve">Bước 1: Mở form tạo khóa mới</w:t>
-      </w:r>
-    </w:p>
-    <w:p>
-      <w:pPr>
-        <w:pStyle w:val="ETCContent"/>
-      </w:pPr>
-      <w:r>
         <w:t xml:space="preserve"/>
       </w:r>
       <w:r>
         <w:drawing>
           <wp:inline>
-            <wp:extent cx="5029200" cy="3143250"/>
+            <wp:extent cx="5029200" cy="5023698"/>
             <wp:docPr id="1017" name="Picture 74505"/>
             <wp:cNvGraphicFramePr>
               <a:graphicFrameLocks noChangeAspect="1"/>
@@ -8259,11 +7409,11 @@
               <a:graphicData uri="http://schemas.openxmlformats.org/drawingml/2006/picture">
                 <pic:pic>
                   <pic:nvPicPr>
-                    <pic:cNvPr id="0" name="instructor-course-step-01-create.png"/>
+                    <pic:cNvPr id="0" name="F-007-step-01-exam-detail.png"/>
                     <pic:cNvPicPr/>
                   </pic:nvPicPr>
                   <pic:blipFill>
-                    <a:blip r:embed="rId26"/>
+                    <a:blip r:embed="rId31"/>
                     <a:stretch>
                       <a:fillRect/>
                     </a:stretch>
@@ -8271,7 +7421,7 @@
                   <pic:spPr>
                     <a:xfrm>
                       <a:off x="0" y="0"/>
-                      <a:ext cx="5029200" cy="3143250"/>
+                      <a:ext cx="5029200" cy="5023698"/>
                     </a:xfrm>
                     <a:prstGeom prst="rect"/>
                   </pic:spPr>
@@ -8287,10 +7437,10 @@
     </w:p>
     <w:p>
       <w:pPr>
-        <w:pStyle w:val="AHeading4"/>
-      </w:pPr>
-      <w:r>
-        <w:t xml:space="preserve">Ngân hàng câu hỏi</w:t>
+        <w:pStyle w:val="ETCContent"/>
+      </w:pPr>
+      <w:r>
+        <w:t xml:space="preserve">→ Kết quả: Trả payload exam detail thành công</w:t>
       </w:r>
     </w:p>
     <w:p>
@@ -8298,7 +7448,34 @@
         <w:pStyle w:val="ETCContent"/>
       </w:pPr>
       <w:r>
-        <w:t xml:space="preserve">CRUD /questions — tạo câu hỏi gắn khóa học, dùng lại khi lắp đề thi.</w:t>
+        <w:rPr>
+          <w:b/>
+        </w:rPr>
+        <w:t>Các trường hợp lỗi:</w:t>
+      </w:r>
+    </w:p>
+    <w:p>
+      <w:pPr>
+        <w:pStyle w:val="ETCContent"/>
+      </w:pPr>
+      <w:r>
+        <w:t xml:space="preserve">• Bước 1: Exam ID không tồn tại → 404 Not Found</w:t>
+      </w:r>
+    </w:p>
+    <w:p>
+      <w:pPr>
+        <w:pStyle w:val="AHeading4"/>
+      </w:pPr>
+      <w:r>
+        <w:t xml:space="preserve">Xác thực JWT qua API</w:t>
+      </w:r>
+    </w:p>
+    <w:p>
+      <w:pPr>
+        <w:pStyle w:val="ETCContent"/>
+      </w:pPr>
+      <w:r>
+        <w:t xml:space="preserve">API cấp token và bảo vệ endpoint bằng JWT.</w:t>
       </w:r>
     </w:p>
     <w:p>
@@ -8309,7 +7486,7 @@
         <w:rPr>
           <w:i/>
         </w:rPr>
-        <w:t xml:space="preserve">Điều kiện tiên quyết: Role instructor; JWT.</w:t>
+        <w:t xml:space="preserve">Điều kiện tiên quyết: Service API chạy tại cổng 4000.</w:t>
       </w:r>
     </w:p>
     <w:p>
@@ -8320,7 +7497,7 @@
         <w:rPr>
           <w:b/>
         </w:rPr>
-        <w:t>Các thành phần trên màn hình:</w:t>
+        <w:t xml:space="preserve">Bước 1: POST /api/v1/auth/login với credentials hợp lệ</w:t>
       </w:r>
     </w:p>
     <w:p>
@@ -8328,15 +7505,7 @@
         <w:pStyle w:val="ETCContent"/>
       </w:pPr>
       <w:r>
-        <w:t xml:space="preserve">• Danh sách câu hỏi (table) — Filter theo khóa</w:t>
-      </w:r>
-    </w:p>
-    <w:p>
-      <w:pPr>
-        <w:pStyle w:val="ETCContent"/>
-      </w:pPr>
-      <w:r>
-        <w:t xml:space="preserve">• Tạo câu hỏi (button) — POST /questions</w:t>
+        <w:t xml:space="preserve">→ Kết quả: Trả access_token</w:t>
       </w:r>
     </w:p>
     <w:p>
@@ -8347,7 +7516,7 @@
         <w:rPr>
           <w:b/>
         </w:rPr>
-        <w:t xml:space="preserve">Bước 1: Mở mục ngân hàng câu hỏi trong khu vực giảng viên</w:t>
+        <w:t xml:space="preserve">Bước 2: Gọi endpoint bảo vệ kèm Authorization Bearer</w:t>
       </w:r>
     </w:p>
     <w:p>
@@ -8355,71 +7524,7 @@
         <w:pStyle w:val="ETCContent"/>
       </w:pPr>
       <w:r>
-        <w:t xml:space="preserve"/>
-      </w:r>
-      <w:r>
-        <w:drawing>
-          <wp:inline>
-            <wp:extent cx="5029200" cy="3143250"/>
-            <wp:docPr id="1018" name="Picture 74505"/>
-            <wp:cNvGraphicFramePr>
-              <a:graphicFrameLocks noChangeAspect="1"/>
-            </wp:cNvGraphicFramePr>
-            <a:graphic>
-              <a:graphicData uri="http://schemas.openxmlformats.org/drawingml/2006/picture">
-                <pic:pic>
-                  <pic:nvPicPr>
-                    <pic:cNvPr id="0" name="instructor-step-01-dashboard.png"/>
-                    <pic:cNvPicPr/>
-                  </pic:nvPicPr>
-                  <pic:blipFill>
-                    <a:blip r:embed="rId24"/>
-                    <a:stretch>
-                      <a:fillRect/>
-                    </a:stretch>
-                  </pic:blipFill>
-                  <pic:spPr>
-                    <a:xfrm>
-                      <a:off x="0" y="0"/>
-                      <a:ext cx="5029200" cy="3143250"/>
-                    </a:xfrm>
-                    <a:prstGeom prst="rect"/>
-                  </pic:spPr>
-                </pic:pic>
-              </a:graphicData>
-            </a:graphic>
-          </wp:inline>
-        </w:drawing>
-      </w:r>
-      <w:r>
-        <w:t xml:space="preserve"/>
-      </w:r>
-    </w:p>
-    <w:p>
-      <w:pPr>
-        <w:pStyle w:val="AHeading4"/>
-      </w:pPr>
-      <w:r>
-        <w:t xml:space="preserve">Chương học  bài giảng (sections / lectures)</w:t>
-      </w:r>
-    </w:p>
-    <w:p>
-      <w:pPr>
-        <w:pStyle w:val="ETCContent"/>
-      </w:pPr>
-      <w:r>
-        <w:t xml:space="preserve">GET/POST /courses/:id/sections; GET/POST /sections/:id/lectures; PATCH reorder.</w:t>
-      </w:r>
-    </w:p>
-    <w:p>
-      <w:pPr>
-        <w:pStyle w:val="ETCContent"/>
-      </w:pPr>
-      <w:r>
-        <w:rPr>
-          <w:i/>
-        </w:rPr>
-        <w:t xml:space="preserve">Điều kiện tiên quyết: Khóa học draft hoặc published thuộc instructor.</w:t>
+        <w:t xml:space="preserve">→ Kết quả: Truy cập tài nguyên thành công</w:t>
       </w:r>
     </w:p>
     <w:p>
@@ -8430,7 +7535,7 @@
         <w:rPr>
           <w:b/>
         </w:rPr>
-        <w:t>Các thành phần trên màn hình:</w:t>
+        <w:t>Các trường hợp lỗi:</w:t>
       </w:r>
     </w:p>
     <w:p>
@@ -8438,610 +7543,7 @@
         <w:pStyle w:val="ETCContent"/>
       </w:pPr>
       <w:r>
-        <w:t xml:space="preserve">• Cây chương (tree) — Kéo thả reorder nếu hỗ trợ</w:t>
-      </w:r>
-    </w:p>
-    <w:p>
-      <w:pPr>
-        <w:pStyle w:val="ETCContent"/>
-      </w:pPr>
-      <w:r>
-        <w:rPr>
-          <w:b/>
-        </w:rPr>
-        <w:t xml:space="preserve">Bước 1: Trong editor khóa, thêm section và bài giảng</w:t>
-      </w:r>
-    </w:p>
-    <w:p>
-      <w:pPr>
-        <w:pStyle w:val="ETCContent"/>
-      </w:pPr>
-      <w:r>
-        <w:t xml:space="preserve"/>
-      </w:r>
-      <w:r>
-        <w:drawing>
-          <wp:inline>
-            <wp:extent cx="5029200" cy="3143250"/>
-            <wp:docPr id="1019" name="Picture 74505"/>
-            <wp:cNvGraphicFramePr>
-              <a:graphicFrameLocks noChangeAspect="1"/>
-            </wp:cNvGraphicFramePr>
-            <a:graphic>
-              <a:graphicData uri="http://schemas.openxmlformats.org/drawingml/2006/picture">
-                <pic:pic>
-                  <pic:nvPicPr>
-                    <pic:cNvPr id="0" name="instructor-course-step-01-create.png"/>
-                    <pic:cNvPicPr/>
-                  </pic:nvPicPr>
-                  <pic:blipFill>
-                    <a:blip r:embed="rId26"/>
-                    <a:stretch>
-                      <a:fillRect/>
-                    </a:stretch>
-                  </pic:blipFill>
-                  <pic:spPr>
-                    <a:xfrm>
-                      <a:off x="0" y="0"/>
-                      <a:ext cx="5029200" cy="3143250"/>
-                    </a:xfrm>
-                    <a:prstGeom prst="rect"/>
-                  </pic:spPr>
-                </pic:pic>
-              </a:graphicData>
-            </a:graphic>
-          </wp:inline>
-        </w:drawing>
-      </w:r>
-      <w:r>
-        <w:t xml:space="preserve"/>
-      </w:r>
-    </w:p>
-    <w:p>
-      <w:pPr>
-        <w:pStyle w:val="AHeading4"/>
-      </w:pPr>
-      <w:r>
-        <w:t xml:space="preserve">Đề thi  gắn câu hỏi vào đề</w:t>
-      </w:r>
-    </w:p>
-    <w:p>
-      <w:pPr>
-        <w:pStyle w:val="ETCContent"/>
-      </w:pPr>
-      <w:r>
-        <w:t xml:space="preserve">GET/POST/PATCH/DELETE /courses/:id/exams và questions trên đề.</w:t>
-      </w:r>
-    </w:p>
-    <w:p>
-      <w:pPr>
-        <w:pStyle w:val="ETCContent"/>
-      </w:pPr>
-      <w:r>
-        <w:rPr>
-          <w:i/>
-        </w:rPr>
-        <w:t xml:space="preserve">Điều kiện tiên quyết: Khóa học có quyền sửa.</w:t>
-      </w:r>
-    </w:p>
-    <w:p>
-      <w:pPr>
-        <w:pStyle w:val="ETCContent"/>
-      </w:pPr>
-      <w:r>
-        <w:rPr>
-          <w:b/>
-        </w:rPr>
-        <w:t>Các thành phần trên màn hình:</w:t>
-      </w:r>
-    </w:p>
-    <w:p>
-      <w:pPr>
-        <w:pStyle w:val="ETCContent"/>
-      </w:pPr>
-      <w:r>
-        <w:t xml:space="preserve">• Danh sách đề (list) — Liên kết question bank</w:t>
-      </w:r>
-    </w:p>
-    <w:p>
-      <w:pPr>
-        <w:pStyle w:val="ETCContent"/>
-      </w:pPr>
-      <w:r>
-        <w:rPr>
-          <w:b/>
-        </w:rPr>
-        <w:t xml:space="preserve">Bước 1: Tạo đề thi và thêm câu hỏi từ ngân hàng</w:t>
-      </w:r>
-    </w:p>
-    <w:p>
-      <w:pPr>
-        <w:pStyle w:val="ETCContent"/>
-      </w:pPr>
-      <w:r>
-        <w:t xml:space="preserve"/>
-      </w:r>
-      <w:r>
-        <w:drawing>
-          <wp:inline>
-            <wp:extent cx="5029200" cy="3143250"/>
-            <wp:docPr id="1020" name="Picture 74505"/>
-            <wp:cNvGraphicFramePr>
-              <a:graphicFrameLocks noChangeAspect="1"/>
-            </wp:cNvGraphicFramePr>
-            <a:graphic>
-              <a:graphicData uri="http://schemas.openxmlformats.org/drawingml/2006/picture">
-                <pic:pic>
-                  <pic:nvPicPr>
-                    <pic:cNvPr id="0" name="instructor-course-step-01-create.png"/>
-                    <pic:cNvPicPr/>
-                  </pic:nvPicPr>
-                  <pic:blipFill>
-                    <a:blip r:embed="rId26"/>
-                    <a:stretch>
-                      <a:fillRect/>
-                    </a:stretch>
-                  </pic:blipFill>
-                  <pic:spPr>
-                    <a:xfrm>
-                      <a:off x="0" y="0"/>
-                      <a:ext cx="5029200" cy="3143250"/>
-                    </a:xfrm>
-                    <a:prstGeom prst="rect"/>
-                  </pic:spPr>
-                </pic:pic>
-              </a:graphicData>
-            </a:graphic>
-          </wp:inline>
-        </w:drawing>
-      </w:r>
-      <w:r>
-        <w:t xml:space="preserve"/>
-      </w:r>
-    </w:p>
-    <w:p>
-      <w:pPr>
-        <w:pStyle w:val="AHeading4"/>
-      </w:pPr>
-      <w:r>
-        <w:t xml:space="preserve">Xuất bản  gỡ xuất bản khóa học</w:t>
-      </w:r>
-    </w:p>
-    <w:p>
-      <w:pPr>
-        <w:pStyle w:val="ETCContent"/>
-      </w:pPr>
-      <w:r>
-        <w:t xml:space="preserve">POST /courses/:id/publish và /unpublish — chuyển trạng thái catalog.</w:t>
-      </w:r>
-    </w:p>
-    <w:p>
-      <w:pPr>
-        <w:pStyle w:val="ETCContent"/>
-      </w:pPr>
-      <w:r>
-        <w:rPr>
-          <w:i/>
-        </w:rPr>
-        <w:t xml:space="preserve">Điều kiện tiên quyết: Khóa đủ điều kiện nghiệp vụ (nội dung tối thiểu).</w:t>
-      </w:r>
-    </w:p>
-    <w:p>
-      <w:pPr>
-        <w:pStyle w:val="ETCContent"/>
-      </w:pPr>
-      <w:r>
-        <w:rPr>
-          <w:b/>
-        </w:rPr>
-        <w:t>Các thành phần trên màn hình:</w:t>
-      </w:r>
-    </w:p>
-    <w:p>
-      <w:pPr>
-        <w:pStyle w:val="ETCContent"/>
-      </w:pPr>
-      <w:r>
-        <w:t xml:space="preserve">• Xuất bản (button) — Confirm dialog</w:t>
-      </w:r>
-    </w:p>
-    <w:p>
-      <w:pPr>
-        <w:pStyle w:val="ETCContent"/>
-      </w:pPr>
-      <w:r>
-        <w:rPr>
-          <w:b/>
-        </w:rPr>
-        <w:t xml:space="preserve">Bước 1: Từ danh sách khóa hoặc editor, thực hiện publish/unpublish</w:t>
-      </w:r>
-    </w:p>
-    <w:p>
-      <w:pPr>
-        <w:pStyle w:val="ETCContent"/>
-      </w:pPr>
-      <w:r>
-        <w:t xml:space="preserve"/>
-      </w:r>
-      <w:r>
-        <w:drawing>
-          <wp:inline>
-            <wp:extent cx="5029200" cy="5832282"/>
-            <wp:docPr id="1021" name="Picture 74505"/>
-            <wp:cNvGraphicFramePr>
-              <a:graphicFrameLocks noChangeAspect="1"/>
-            </wp:cNvGraphicFramePr>
-            <a:graphic>
-              <a:graphicData uri="http://schemas.openxmlformats.org/drawingml/2006/picture">
-                <pic:pic>
-                  <pic:nvPicPr>
-                    <pic:cNvPr id="0" name="instructor-courses-step-01-list.png"/>
-                    <pic:cNvPicPr/>
-                  </pic:nvPicPr>
-                  <pic:blipFill>
-                    <a:blip r:embed="rId25"/>
-                    <a:stretch>
-                      <a:fillRect/>
-                    </a:stretch>
-                  </pic:blipFill>
-                  <pic:spPr>
-                    <a:xfrm>
-                      <a:off x="0" y="0"/>
-                      <a:ext cx="5029200" cy="5832282"/>
-                    </a:xfrm>
-                    <a:prstGeom prst="rect"/>
-                  </pic:spPr>
-                </pic:pic>
-              </a:graphicData>
-            </a:graphic>
-          </wp:inline>
-        </w:drawing>
-      </w:r>
-      <w:r>
-        <w:t xml:space="preserve"/>
-      </w:r>
-    </w:p>
-    <w:p>
-      <w:pPr>
-        <w:pStyle w:val="AHeading3"/>
-      </w:pPr>
-      <w:r>
-        <w:t xml:space="preserve">Tài khoản  phiên đăng nhập</w:t>
-      </w:r>
-    </w:p>
-    <w:p>
-      <w:pPr>
-        <w:pStyle w:val="AHeading4"/>
-      </w:pPr>
-      <w:r>
-        <w:t xml:space="preserve">Đăng ký  xác minh email</w:t>
-      </w:r>
-    </w:p>
-    <w:p>
-      <w:pPr>
-        <w:pStyle w:val="ETCContent"/>
-      </w:pPr>
-      <w:r>
-        <w:t xml:space="preserve">POST /auth/register, /auth/verify-email, /auth/resend-verification.</w:t>
-      </w:r>
-    </w:p>
-    <w:p>
-      <w:pPr>
-        <w:pStyle w:val="ETCContent"/>
-      </w:pPr>
-      <w:r>
-        <w:rPr>
-          <w:i/>
-        </w:rPr>
-        <w:t xml:space="preserve">Điều kiện tiên quyết: Email chưa tồn tại; SMTP/callback cấu hình.</w:t>
-      </w:r>
-    </w:p>
-    <w:p>
-      <w:pPr>
-        <w:pStyle w:val="ETCContent"/>
-      </w:pPr>
-      <w:r>
-        <w:rPr>
-          <w:b/>
-        </w:rPr>
-        <w:t>Các thành phần trên màn hình:</w:t>
-      </w:r>
-    </w:p>
-    <w:p>
-      <w:pPr>
-        <w:pStyle w:val="ETCContent"/>
-      </w:pPr>
-      <w:r>
-        <w:t xml:space="preserve">• Form đăng ký (form) — Mật khẩu theo policy</w:t>
-      </w:r>
-    </w:p>
-    <w:p>
-      <w:pPr>
-        <w:pStyle w:val="ETCContent"/>
-      </w:pPr>
-      <w:r>
-        <w:t xml:space="preserve">• Link xác minh (link) — Token trong email</w:t>
-      </w:r>
-    </w:p>
-    <w:p>
-      <w:pPr>
-        <w:pStyle w:val="ETCContent"/>
-      </w:pPr>
-      <w:r>
-        <w:rPr>
-          <w:b/>
-        </w:rPr>
-        <w:t xml:space="preserve">Bước 1: Hoàn tất form đăng ký và mở link xác minh (email)</w:t>
-      </w:r>
-    </w:p>
-    <w:p>
-      <w:pPr>
-        <w:pStyle w:val="AHeading4"/>
-      </w:pPr>
-      <w:r>
-        <w:t xml:space="preserve">Quên mật khẩu  đặt lại</w:t>
-      </w:r>
-    </w:p>
-    <w:p>
-      <w:pPr>
-        <w:pStyle w:val="ETCContent"/>
-      </w:pPr>
-      <w:r>
-        <w:t xml:space="preserve">POST /auth/forgot-password, /auth/reset-password; PATCH /auth/update-password khi đã đăng nhập.</w:t>
-      </w:r>
-    </w:p>
-    <w:p>
-      <w:pPr>
-        <w:pStyle w:val="ETCContent"/>
-      </w:pPr>
-      <w:r>
-        <w:rPr>
-          <w:i/>
-        </w:rPr>
-        <w:t xml:space="preserve">Điều kiện tiên quyết: Biết email đã đăng ký (forgot flow).</w:t>
-      </w:r>
-    </w:p>
-    <w:p>
-      <w:pPr>
-        <w:pStyle w:val="ETCContent"/>
-      </w:pPr>
-      <w:r>
-        <w:rPr>
-          <w:b/>
-        </w:rPr>
-        <w:t>Các thành phần trên màn hình:</w:t>
-      </w:r>
-    </w:p>
-    <w:p>
-      <w:pPr>
-        <w:pStyle w:val="ETCContent"/>
-      </w:pPr>
-      <w:r>
-        <w:t xml:space="preserve">• Quên mật khẩu (link) — Gửi email reset</w:t>
-      </w:r>
-    </w:p>
-    <w:p>
-      <w:pPr>
-        <w:pStyle w:val="ETCContent"/>
-      </w:pPr>
-      <w:r>
-        <w:rPr>
-          <w:b/>
-        </w:rPr>
-        <w:t xml:space="preserve">Bước 1: Luồng forgot → nhập token → đặt mật khẩu mới</w:t>
-      </w:r>
-    </w:p>
-    <w:p>
-      <w:pPr>
-        <w:pStyle w:val="AHeading3"/>
-      </w:pPr>
-      <w:r>
-        <w:t xml:space="preserve">Thanh toán</w:t>
-      </w:r>
-    </w:p>
-    <w:p>
-      <w:pPr>
-        <w:pStyle w:val="AHeading4"/>
-      </w:pPr>
-      <w:r>
-        <w:t xml:space="preserve">Thanh toán khóa học (Stripe)</w:t>
-      </w:r>
-    </w:p>
-    <w:p>
-      <w:pPr>
-        <w:pStyle w:val="ETCContent"/>
-      </w:pPr>
-      <w:r>
-        <w:t xml:space="preserve">POST /payments/create-intent; GET /payments lịch sử; webhook /payments/webhook chữ ký Stripe.</w:t>
-      </w:r>
-    </w:p>
-    <w:p>
-      <w:pPr>
-        <w:pStyle w:val="ETCContent"/>
-      </w:pPr>
-      <w:r>
-        <w:rPr>
-          <w:i/>
-        </w:rPr>
-        <w:t xml:space="preserve">Điều kiện tiên quyết: Stripe keys; khóa có giá.</w:t>
-      </w:r>
-    </w:p>
-    <w:p>
-      <w:pPr>
-        <w:pStyle w:val="ETCContent"/>
-      </w:pPr>
-      <w:r>
-        <w:rPr>
-          <w:b/>
-        </w:rPr>
-        <w:t>Các thành phần trên màn hình:</w:t>
-      </w:r>
-    </w:p>
-    <w:p>
-      <w:pPr>
-        <w:pStyle w:val="ETCContent"/>
-      </w:pPr>
-      <w:r>
-        <w:t xml:space="preserve">• Thanh toán (button) — Stripe Elements / redirect theo triển khai</w:t>
-      </w:r>
-    </w:p>
-    <w:p>
-      <w:pPr>
-        <w:pStyle w:val="ETCContent"/>
-      </w:pPr>
-      <w:r>
-        <w:rPr>
-          <w:b/>
-        </w:rPr>
-        <w:t xml:space="preserve">Bước 1: Chọn mua khóa và hoàn tất thanh toán test</w:t>
-      </w:r>
-    </w:p>
-    <w:p>
-      <w:pPr>
-        <w:pStyle w:val="AHeading3"/>
-      </w:pPr>
-      <w:r>
-        <w:t xml:space="preserve">Chứng chỉ  tích hợp hệ thống</w:t>
-      </w:r>
-    </w:p>
-    <w:p>
-      <w:pPr>
-        <w:pStyle w:val="AHeading4"/>
-      </w:pPr>
-      <w:r>
-        <w:t xml:space="preserve">Xác minh chứng chỉ công khai</w:t>
-      </w:r>
-    </w:p>
-    <w:p>
-      <w:pPr>
-        <w:pStyle w:val="ETCContent"/>
-      </w:pPr>
-      <w:r>
-        <w:t xml:space="preserve">GET /certificates/verify/:verifyCode — không cần JWT.</w:t>
-      </w:r>
-    </w:p>
-    <w:p>
-      <w:pPr>
-        <w:pStyle w:val="ETCContent"/>
-      </w:pPr>
-      <w:r>
-        <w:rPr>
-          <w:i/>
-        </w:rPr>
-        <w:t xml:space="preserve">Điều kiện tiên quyết: Mã verify hợp lệ.</w:t>
-      </w:r>
-    </w:p>
-    <w:p>
-      <w:pPr>
-        <w:pStyle w:val="ETCContent"/>
-      </w:pPr>
-      <w:r>
-        <w:rPr>
-          <w:b/>
-        </w:rPr>
-        <w:t>Các thành phần trên màn hình:</w:t>
-      </w:r>
-    </w:p>
-    <w:p>
-      <w:pPr>
-        <w:pStyle w:val="ETCContent"/>
-      </w:pPr>
-      <w:r>
-        <w:t xml:space="preserve">• Ô mã xác minh (input) — Public landing page</w:t>
-      </w:r>
-    </w:p>
-    <w:p>
-      <w:pPr>
-        <w:pStyle w:val="ETCContent"/>
-      </w:pPr>
-      <w:r>
-        <w:rPr>
-          <w:b/>
-        </w:rPr>
-        <w:t xml:space="preserve">Bước 1: Nhập mã verify trên trang công khai</w:t>
-      </w:r>
-    </w:p>
-    <w:p>
-      <w:pPr>
-        <w:pStyle w:val="AHeading4"/>
-      </w:pPr>
-      <w:r>
-        <w:t xml:space="preserve">Giám sát thi: WebSocket  API nội bộ</w:t>
-      </w:r>
-    </w:p>
-    <w:p>
-      <w:pPr>
-        <w:pStyle w:val="ETCContent"/>
-      </w:pPr>
-      <w:r>
-        <w:t xml:space="preserve">WS /exam-sessions/:session_id/ws (Fastify); POST/GET /internal/exam-sessions/:id/violations|state với internal token.</w:t>
-      </w:r>
-    </w:p>
-    <w:p>
-      <w:pPr>
-        <w:pStyle w:val="ETCContent"/>
-      </w:pPr>
-      <w:r>
-        <w:rPr>
-          <w:i/>
-        </w:rPr>
-        <w:t xml:space="preserve">Điều kiện tiên quyết: Internal token cấu hình; session đang active.</w:t>
-      </w:r>
-    </w:p>
-    <w:p>
-      <w:pPr>
-        <w:pStyle w:val="ETCContent"/>
-      </w:pPr>
-      <w:r>
-        <w:rPr>
-          <w:b/>
-        </w:rPr>
-        <w:t xml:space="preserve">Bước 1: Client phòng thi duy trì kết nối WS; server ghi nhận vi phạm</w:t>
-      </w:r>
-    </w:p>
-    <w:p>
-      <w:pPr>
-        <w:pStyle w:val="ETCContent"/>
-      </w:pPr>
-      <w:r>
-        <w:t xml:space="preserve"/>
-      </w:r>
-      <w:r>
-        <w:drawing>
-          <wp:inline>
-            <wp:extent cx="5029200" cy="3143250"/>
-            <wp:docPr id="1022" name="Picture 74505"/>
-            <wp:cNvGraphicFramePr>
-              <a:graphicFrameLocks noChangeAspect="1"/>
-            </wp:cNvGraphicFramePr>
-            <a:graphic>
-              <a:graphicData uri="http://schemas.openxmlformats.org/drawingml/2006/picture">
-                <pic:pic>
-                  <pic:nvPicPr>
-                    <pic:cNvPr id="0" name="exam-room-step-01-initial.png"/>
-                    <pic:cNvPicPr/>
-                  </pic:nvPicPr>
-                  <pic:blipFill>
-                    <a:blip r:embed="rId23"/>
-                    <a:stretch>
-                      <a:fillRect/>
-                    </a:stretch>
-                  </pic:blipFill>
-                  <pic:spPr>
-                    <a:xfrm>
-                      <a:off x="0" y="0"/>
-                      <a:ext cx="5029200" cy="3143250"/>
-                    </a:xfrm>
-                    <a:prstGeom prst="rect"/>
-                  </pic:spPr>
-                </pic:pic>
-              </a:graphicData>
-            </a:graphic>
-          </wp:inline>
-        </w:drawing>
-      </w:r>
-      <w:r>
-        <w:t xml:space="preserve"/>
+        <w:t xml:space="preserve">• Bước 1: Sai thông tin đăng nhập → 401 Unauthorized</w:t>
       </w:r>
     </w:p>
     <w:p>
@@ -9135,7 +7637,7 @@
           </w:tcPr>
           <w:p>
             <w:r>
-              <w:t xml:space="preserve">Không đăng nhập được (401/403)</w:t>
+              <w:t xml:space="preserve">Đăng nhập thất bại liên tục</w:t>
             </w:r>
           </w:p>
         </w:tc>
@@ -9145,7 +7647,7 @@
           </w:tcPr>
           <w:p>
             <w:r>
-              <w:t xml:space="preserve">Sai mật khẩu, email chưa xác minh, hoặc token hết hạn</w:t>
+              <w:t xml:space="preserve">Sai credentials hoặc seed dữ liệu chưa chạy</w:t>
             </w:r>
           </w:p>
         </w:tc>
@@ -9155,7 +7657,7 @@
           </w:tcPr>
           <w:p>
             <w:r>
-              <w:t xml:space="preserve">Dùng forgot-password, kiểm tra email verify, xóa cookie/localStorage và thử lại</w:t>
+              <w:t xml:space="preserve">Dùng admin/admin hoặc instructor@local.test/dev-instructor, kiểm tra lại dữ liệu mẫu</w:t>
             </w:r>
           </w:p>
         </w:tc>
@@ -9177,7 +7679,7 @@
           </w:tcPr>
           <w:p>
             <w:r>
-              <w:t xml:space="preserve">eKYC không bật camera</w:t>
+              <w:t xml:space="preserve">Màn hình khóa học trống</w:t>
             </w:r>
           </w:p>
         </w:tc>
@@ -9187,7 +7689,7 @@
           </w:tcPr>
           <w:p>
             <w:r>
-              <w:t xml:space="preserve">Quyền trình duyệt hoặc thiết bị bị chặn</w:t>
+              <w:t xml:space="preserve">API /courses lỗi hoặc không có dữ liệu</w:t>
             </w:r>
           </w:p>
         </w:tc>
@@ -9197,7 +7699,7 @@
           </w:tcPr>
           <w:p>
             <w:r>
-              <w:t xml:space="preserve">Cấp quyền site trong trình duyệt, thử trình duyệt khác, tắt extension chặn media</w:t>
+              <w:t xml:space="preserve">Kiểm tra log service api, tạo dữ liệu course mẫu từ instructor</w:t>
             </w:r>
           </w:p>
         </w:tc>
@@ -9219,7 +7721,7 @@
           </w:tcPr>
           <w:p>
             <w:r>
-              <w:t xml:space="preserve">Thanh toán Stripe không hoàn tất</w:t>
+              <w:t xml:space="preserve">Không vào được eKYC</w:t>
             </w:r>
           </w:p>
         </w:tc>
@@ -9229,7 +7731,7 @@
           </w:tcPr>
           <w:p>
             <w:r>
-              <w:t xml:space="preserve">Thiếu STRIPE_SECRET_KEY, webhook chưa cấu hình, hoặc client_secret hết hạn</w:t>
+              <w:t xml:space="preserve">Browser chưa cấp quyền camera/microphone</w:t>
             </w:r>
           </w:p>
         </w:tc>
@@ -9239,7 +7741,7 @@
           </w:tcPr>
           <w:p>
             <w:r>
-              <w:t xml:space="preserve">Kiểm tra .env và Stripe Dashboard; dùng Stripe CLI forward webhook khi dev local</w:t>
+              <w:t xml:space="preserve">Cấp quyền thiết bị trong trình duyệt và tải lại phiên thi</w:t>
             </w:r>
           </w:p>
         </w:tc>
@@ -9261,7 +7763,7 @@
           </w:tcPr>
           <w:p>
             <w:r>
-              <w:t xml:space="preserve">Phòng thi mất kết nối WebSocket hoặc tự submit</w:t>
+              <w:t xml:space="preserve">Publish khóa học bị lỗi quyền</w:t>
             </w:r>
           </w:p>
         </w:tc>
@@ -9271,7 +7773,7 @@
           </w:tcPr>
           <w:p>
             <w:r>
-              <w:t xml:space="preserve">Redis unavailable, idle timeout, hoặc vi phạm TAB_SWITCH/NO_FACE kích hoạt auto-submit</w:t>
+              <w:t xml:space="preserve">Token không thuộc vai trò instructor/admin</w:t>
             </w:r>
           </w:p>
         </w:tc>
@@ -9281,7 +7783,7 @@
           </w:tcPr>
           <w:p>
             <w:r>
-              <w:t xml:space="preserve">Kiểm tra proctoring logs, Redis; tắt tab thừa; đọc close code 4401/1011 trong code-facts ws_events</w:t>
+              <w:t xml:space="preserve">Đăng nhập bằng tài khoản instructor hoặc admin trước khi thao tác</w:t>
             </w:r>
           </w:p>
         </w:tc>
@@ -9498,7 +8000,7 @@
       <w:rPr>
         <w:noProof/>
       </w:rPr>
-      <w:t xml:space="preserve">EDUPROCTOR-LMS - Tài liệu hướng dẫn sử dụng</w:t>
+      <w:t xml:space="preserve">EDUPROCTOR-2026 - Tài liệu hướng dẫn sử dụng</w:t>
       <w:tab/>
       <w:tab/>
       <w:t xml:space="preserve">Phiên bản: 1.0</w:t>

</xml_diff>